<commit_message>
feat(availability): event-based replication + routing data source + 75 tests
</commit_message>
<xml_diff>
--- a/software-quality/04-test-design/black box test design.docx
+++ b/software-quality/04-test-design/black box test design.docx
@@ -1584,6 +1584,1340 @@
       </w:r>
     </w:p>
     <w:p>
+      <w:r>
+        <w:t>Complete State Transition Matrix</w:t>
+      </w:r>
+    </w:p>
+    <w:p>
+      <w:r>
+        <w:t>The state machine has 4 states and 6 operations giving a 4 x 6 matrix of 24 possible (state, operation) pairs. 6 are valid and 18 are invalid. The parameterized test invalidStateTransitionIsRejected covers all 18 invalid pairs in a single test method. Combined with the 5 valid-transition tests above, the matrix is fully covered.</w:t>
+      </w:r>
+    </w:p>
+    <w:p>
+      <w:r>
+        <w:t>Matrix (V = valid transition, INV = must throw)</w:t>
+      </w:r>
+    </w:p>
+    <w:tbl>
+      <w:tblPr>
+        <w:tblW w:w="0" w:type="auto"/>
+        <w:tblCellMar>
+          <w:top w:w="15" w:type="dxa"/>
+          <w:left w:w="15" w:type="dxa"/>
+          <w:bottom w:w="15" w:type="dxa"/>
+          <w:right w:w="15" w:type="dxa"/>
+        </w:tblCellMar>
+        <w:tblLook w:val="04A0" w:firstRow="1" w:lastRow="0" w:firstColumn="1" w:lastColumn="0" w:noHBand="0" w:noVBand="1"/>
+      </w:tblPr>
+      <w:tblGrid>
+        <w:gridCol w:w="1285"/>
+        <w:gridCol w:w="1285"/>
+        <w:gridCol w:w="1285"/>
+        <w:gridCol w:w="1285"/>
+        <w:gridCol w:w="1285"/>
+        <w:gridCol w:w="1285"/>
+        <w:gridCol w:w="1285"/>
+      </w:tblGrid>
+      <w:tr>
+        <w:tc>
+          <w:tcPr>
+            <w:tcW w:w="1285" w:type="auto"/>
+            <w:tcBorders>
+              <w:top w:val="single" w:sz="6" w:space="0" w:color="8A8A8A"/>
+              <w:left w:val="single" w:sz="6" w:space="0" w:color="8A8A8A"/>
+              <w:bottom w:val="single" w:sz="6" w:space="0" w:color="8A8A8A"/>
+              <w:right w:val="single" w:sz="6" w:space="0" w:color="8A8A8A"/>
+            </w:tcBorders>
+            <w:shd w:val="clear" w:color="auto" w:fill="D9EAF7"/>
+            <w:tcMar>
+              <w:top w:w="100" w:type="dxa"/>
+              <w:left w:w="100" w:type="dxa"/>
+              <w:bottom w:w="100" w:type="dxa"/>
+              <w:right w:w="100" w:type="dxa"/>
+            </w:tcMar>
+            <w:hideMark/>
+          </w:tcPr>
+          <w:p>
+            <w:r>
+              <w:rPr>
+                <w:b/>
+                <w:bCs/>
+              </w:rPr>
+              <w:t>From state</w:t>
+            </w:r>
+          </w:p>
+        </w:tc>
+        <w:tc>
+          <w:tcPr>
+            <w:tcW w:w="1285" w:type="auto"/>
+            <w:tcBorders>
+              <w:top w:val="single" w:sz="6" w:space="0" w:color="8A8A8A"/>
+              <w:left w:val="single" w:sz="6" w:space="0" w:color="8A8A8A"/>
+              <w:bottom w:val="single" w:sz="6" w:space="0" w:color="8A8A8A"/>
+              <w:right w:val="single" w:sz="6" w:space="0" w:color="8A8A8A"/>
+            </w:tcBorders>
+            <w:shd w:val="clear" w:color="auto" w:fill="D9EAF7"/>
+            <w:tcMar>
+              <w:top w:w="100" w:type="dxa"/>
+              <w:left w:w="100" w:type="dxa"/>
+              <w:bottom w:w="100" w:type="dxa"/>
+              <w:right w:w="100" w:type="dxa"/>
+            </w:tcMar>
+            <w:hideMark/>
+          </w:tcPr>
+          <w:p>
+            <w:r>
+              <w:rPr>
+                <w:b/>
+                <w:bCs/>
+              </w:rPr>
+              <w:t>beginFailover</w:t>
+            </w:r>
+          </w:p>
+        </w:tc>
+        <w:tc>
+          <w:tcPr>
+            <w:tcW w:w="1285" w:type="auto"/>
+            <w:tcBorders>
+              <w:top w:val="single" w:sz="6" w:space="0" w:color="8A8A8A"/>
+              <w:left w:val="single" w:sz="6" w:space="0" w:color="8A8A8A"/>
+              <w:bottom w:val="single" w:sz="6" w:space="0" w:color="8A8A8A"/>
+              <w:right w:val="single" w:sz="6" w:space="0" w:color="8A8A8A"/>
+            </w:tcBorders>
+            <w:shd w:val="clear" w:color="auto" w:fill="D9EAF7"/>
+            <w:tcMar>
+              <w:top w:w="100" w:type="dxa"/>
+              <w:left w:w="100" w:type="dxa"/>
+              <w:bottom w:w="100" w:type="dxa"/>
+              <w:right w:w="100" w:type="dxa"/>
+            </w:tcMar>
+            <w:hideMark/>
+          </w:tcPr>
+          <w:p>
+            <w:r>
+              <w:rPr>
+                <w:b/>
+                <w:bCs/>
+              </w:rPr>
+              <w:t>completeFailover</w:t>
+            </w:r>
+          </w:p>
+        </w:tc>
+        <w:tc>
+          <w:tcPr>
+            <w:tcW w:w="1285" w:type="auto"/>
+            <w:tcBorders>
+              <w:top w:val="single" w:sz="6" w:space="0" w:color="8A8A8A"/>
+              <w:left w:val="single" w:sz="6" w:space="0" w:color="8A8A8A"/>
+              <w:bottom w:val="single" w:sz="6" w:space="0" w:color="8A8A8A"/>
+              <w:right w:val="single" w:sz="6" w:space="0" w:color="8A8A8A"/>
+            </w:tcBorders>
+            <w:shd w:val="clear" w:color="auto" w:fill="D9EAF7"/>
+            <w:tcMar>
+              <w:top w:w="100" w:type="dxa"/>
+              <w:left w:w="100" w:type="dxa"/>
+              <w:bottom w:w="100" w:type="dxa"/>
+              <w:right w:w="100" w:type="dxa"/>
+            </w:tcMar>
+            <w:hideMark/>
+          </w:tcPr>
+          <w:p>
+            <w:r>
+              <w:rPr>
+                <w:b/>
+                <w:bCs/>
+              </w:rPr>
+              <w:t>abortFailover</w:t>
+            </w:r>
+          </w:p>
+        </w:tc>
+        <w:tc>
+          <w:tcPr>
+            <w:tcW w:w="1285" w:type="auto"/>
+            <w:tcBorders>
+              <w:top w:val="single" w:sz="6" w:space="0" w:color="8A8A8A"/>
+              <w:left w:val="single" w:sz="6" w:space="0" w:color="8A8A8A"/>
+              <w:bottom w:val="single" w:sz="6" w:space="0" w:color="8A8A8A"/>
+              <w:right w:val="single" w:sz="6" w:space="0" w:color="8A8A8A"/>
+            </w:tcBorders>
+            <w:shd w:val="clear" w:color="auto" w:fill="D9EAF7"/>
+            <w:tcMar>
+              <w:top w:w="100" w:type="dxa"/>
+              <w:left w:w="100" w:type="dxa"/>
+              <w:bottom w:w="100" w:type="dxa"/>
+              <w:right w:w="100" w:type="dxa"/>
+            </w:tcMar>
+            <w:hideMark/>
+          </w:tcPr>
+          <w:p>
+            <w:r>
+              <w:rPr>
+                <w:b/>
+                <w:bCs/>
+              </w:rPr>
+              <w:t>beginFailback</w:t>
+            </w:r>
+          </w:p>
+        </w:tc>
+        <w:tc>
+          <w:tcPr>
+            <w:tcW w:w="1285" w:type="auto"/>
+            <w:tcBorders>
+              <w:top w:val="single" w:sz="6" w:space="0" w:color="8A8A8A"/>
+              <w:left w:val="single" w:sz="6" w:space="0" w:color="8A8A8A"/>
+              <w:bottom w:val="single" w:sz="6" w:space="0" w:color="8A8A8A"/>
+              <w:right w:val="single" w:sz="6" w:space="0" w:color="8A8A8A"/>
+            </w:tcBorders>
+            <w:shd w:val="clear" w:color="auto" w:fill="D9EAF7"/>
+            <w:tcMar>
+              <w:top w:w="100" w:type="dxa"/>
+              <w:left w:w="100" w:type="dxa"/>
+              <w:bottom w:w="100" w:type="dxa"/>
+              <w:right w:w="100" w:type="dxa"/>
+            </w:tcMar>
+            <w:hideMark/>
+          </w:tcPr>
+          <w:p>
+            <w:r>
+              <w:rPr>
+                <w:b/>
+                <w:bCs/>
+              </w:rPr>
+              <w:t>completeFailback</w:t>
+            </w:r>
+          </w:p>
+        </w:tc>
+        <w:tc>
+          <w:tcPr>
+            <w:tcW w:w="1285" w:type="auto"/>
+            <w:tcBorders>
+              <w:top w:val="single" w:sz="6" w:space="0" w:color="8A8A8A"/>
+              <w:left w:val="single" w:sz="6" w:space="0" w:color="8A8A8A"/>
+              <w:bottom w:val="single" w:sz="6" w:space="0" w:color="8A8A8A"/>
+              <w:right w:val="single" w:sz="6" w:space="0" w:color="8A8A8A"/>
+            </w:tcBorders>
+            <w:shd w:val="clear" w:color="auto" w:fill="D9EAF7"/>
+            <w:tcMar>
+              <w:top w:w="100" w:type="dxa"/>
+              <w:left w:w="100" w:type="dxa"/>
+              <w:bottom w:w="100" w:type="dxa"/>
+              <w:right w:w="100" w:type="dxa"/>
+            </w:tcMar>
+            <w:hideMark/>
+          </w:tcPr>
+          <w:p>
+            <w:r>
+              <w:rPr>
+                <w:b/>
+                <w:bCs/>
+              </w:rPr>
+              <w:t>abortFailback</w:t>
+            </w:r>
+          </w:p>
+        </w:tc>
+      </w:tr>
+      <w:tr>
+        <w:tc>
+          <w:tcPr>
+            <w:tcW w:w="1285" w:type="auto"/>
+            <w:tcBorders>
+              <w:top w:val="single" w:sz="6" w:space="0" w:color="8A8A8A"/>
+              <w:left w:val="single" w:sz="6" w:space="0" w:color="8A8A8A"/>
+              <w:bottom w:val="single" w:sz="6" w:space="0" w:color="8A8A8A"/>
+              <w:right w:val="single" w:sz="6" w:space="0" w:color="8A8A8A"/>
+            </w:tcBorders>
+            <w:shd w:val="clear" w:color="auto" w:fill="D9EAF7"/>
+            <w:tcMar>
+              <w:top w:w="100" w:type="dxa"/>
+              <w:left w:w="100" w:type="dxa"/>
+              <w:bottom w:w="100" w:type="dxa"/>
+              <w:right w:w="100" w:type="dxa"/>
+            </w:tcMar>
+            <w:hideMark/>
+          </w:tcPr>
+          <w:p>
+            <w:r>
+              <w:t>PRIMARY_ACTIVE</w:t>
+            </w:r>
+          </w:p>
+        </w:tc>
+        <w:tc>
+          <w:tcPr>
+            <w:tcW w:w="1285" w:type="auto"/>
+            <w:tcBorders>
+              <w:top w:val="single" w:sz="6" w:space="0" w:color="8A8A8A"/>
+              <w:left w:val="single" w:sz="6" w:space="0" w:color="8A8A8A"/>
+              <w:bottom w:val="single" w:sz="6" w:space="0" w:color="8A8A8A"/>
+              <w:right w:val="single" w:sz="6" w:space="0" w:color="8A8A8A"/>
+            </w:tcBorders>
+            <w:shd w:val="clear" w:color="auto" w:fill="D9EAF7"/>
+            <w:tcMar>
+              <w:top w:w="100" w:type="dxa"/>
+              <w:left w:w="100" w:type="dxa"/>
+              <w:bottom w:w="100" w:type="dxa"/>
+              <w:right w:w="100" w:type="dxa"/>
+            </w:tcMar>
+            <w:hideMark/>
+          </w:tcPr>
+          <w:p>
+            <w:r>
+              <w:t>V</w:t>
+            </w:r>
+          </w:p>
+        </w:tc>
+        <w:tc>
+          <w:tcPr>
+            <w:tcW w:w="1285" w:type="auto"/>
+            <w:tcBorders>
+              <w:top w:val="single" w:sz="6" w:space="0" w:color="8A8A8A"/>
+              <w:left w:val="single" w:sz="6" w:space="0" w:color="8A8A8A"/>
+              <w:bottom w:val="single" w:sz="6" w:space="0" w:color="8A8A8A"/>
+              <w:right w:val="single" w:sz="6" w:space="0" w:color="8A8A8A"/>
+            </w:tcBorders>
+            <w:shd w:val="clear" w:color="auto" w:fill="D9EAF7"/>
+            <w:tcMar>
+              <w:top w:w="100" w:type="dxa"/>
+              <w:left w:w="100" w:type="dxa"/>
+              <w:bottom w:w="100" w:type="dxa"/>
+              <w:right w:w="100" w:type="dxa"/>
+            </w:tcMar>
+            <w:hideMark/>
+          </w:tcPr>
+          <w:p>
+            <w:r>
+              <w:t>INV</w:t>
+            </w:r>
+          </w:p>
+        </w:tc>
+        <w:tc>
+          <w:tcPr>
+            <w:tcW w:w="1285" w:type="auto"/>
+            <w:tcBorders>
+              <w:top w:val="single" w:sz="6" w:space="0" w:color="8A8A8A"/>
+              <w:left w:val="single" w:sz="6" w:space="0" w:color="8A8A8A"/>
+              <w:bottom w:val="single" w:sz="6" w:space="0" w:color="8A8A8A"/>
+              <w:right w:val="single" w:sz="6" w:space="0" w:color="8A8A8A"/>
+            </w:tcBorders>
+            <w:shd w:val="clear" w:color="auto" w:fill="D9EAF7"/>
+            <w:tcMar>
+              <w:top w:w="100" w:type="dxa"/>
+              <w:left w:w="100" w:type="dxa"/>
+              <w:bottom w:w="100" w:type="dxa"/>
+              <w:right w:w="100" w:type="dxa"/>
+            </w:tcMar>
+            <w:hideMark/>
+          </w:tcPr>
+          <w:p>
+            <w:r>
+              <w:t>INV</w:t>
+            </w:r>
+          </w:p>
+        </w:tc>
+        <w:tc>
+          <w:tcPr>
+            <w:tcW w:w="1285" w:type="auto"/>
+            <w:tcBorders>
+              <w:top w:val="single" w:sz="6" w:space="0" w:color="8A8A8A"/>
+              <w:left w:val="single" w:sz="6" w:space="0" w:color="8A8A8A"/>
+              <w:bottom w:val="single" w:sz="6" w:space="0" w:color="8A8A8A"/>
+              <w:right w:val="single" w:sz="6" w:space="0" w:color="8A8A8A"/>
+            </w:tcBorders>
+            <w:shd w:val="clear" w:color="auto" w:fill="D9EAF7"/>
+            <w:tcMar>
+              <w:top w:w="100" w:type="dxa"/>
+              <w:left w:w="100" w:type="dxa"/>
+              <w:bottom w:w="100" w:type="dxa"/>
+              <w:right w:w="100" w:type="dxa"/>
+            </w:tcMar>
+            <w:hideMark/>
+          </w:tcPr>
+          <w:p>
+            <w:r>
+              <w:t>INV</w:t>
+            </w:r>
+          </w:p>
+        </w:tc>
+        <w:tc>
+          <w:tcPr>
+            <w:tcW w:w="1285" w:type="auto"/>
+            <w:tcBorders>
+              <w:top w:val="single" w:sz="6" w:space="0" w:color="8A8A8A"/>
+              <w:left w:val="single" w:sz="6" w:space="0" w:color="8A8A8A"/>
+              <w:bottom w:val="single" w:sz="6" w:space="0" w:color="8A8A8A"/>
+              <w:right w:val="single" w:sz="6" w:space="0" w:color="8A8A8A"/>
+            </w:tcBorders>
+            <w:shd w:val="clear" w:color="auto" w:fill="D9EAF7"/>
+            <w:tcMar>
+              <w:top w:w="100" w:type="dxa"/>
+              <w:left w:w="100" w:type="dxa"/>
+              <w:bottom w:w="100" w:type="dxa"/>
+              <w:right w:w="100" w:type="dxa"/>
+            </w:tcMar>
+            <w:hideMark/>
+          </w:tcPr>
+          <w:p>
+            <w:r>
+              <w:t>INV</w:t>
+            </w:r>
+          </w:p>
+        </w:tc>
+        <w:tc>
+          <w:tcPr>
+            <w:tcW w:w="1285" w:type="auto"/>
+            <w:tcBorders>
+              <w:top w:val="single" w:sz="6" w:space="0" w:color="8A8A8A"/>
+              <w:left w:val="single" w:sz="6" w:space="0" w:color="8A8A8A"/>
+              <w:bottom w:val="single" w:sz="6" w:space="0" w:color="8A8A8A"/>
+              <w:right w:val="single" w:sz="6" w:space="0" w:color="8A8A8A"/>
+            </w:tcBorders>
+            <w:shd w:val="clear" w:color="auto" w:fill="D9EAF7"/>
+            <w:tcMar>
+              <w:top w:w="100" w:type="dxa"/>
+              <w:left w:w="100" w:type="dxa"/>
+              <w:bottom w:w="100" w:type="dxa"/>
+              <w:right w:w="100" w:type="dxa"/>
+            </w:tcMar>
+            <w:hideMark/>
+          </w:tcPr>
+          <w:p>
+            <w:r>
+              <w:t>INV</w:t>
+            </w:r>
+          </w:p>
+        </w:tc>
+      </w:tr>
+      <w:tr>
+        <w:tc>
+          <w:tcPr>
+            <w:tcW w:w="1285" w:type="auto"/>
+            <w:tcBorders>
+              <w:top w:val="single" w:sz="6" w:space="0" w:color="8A8A8A"/>
+              <w:left w:val="single" w:sz="6" w:space="0" w:color="8A8A8A"/>
+              <w:bottom w:val="single" w:sz="6" w:space="0" w:color="8A8A8A"/>
+              <w:right w:val="single" w:sz="6" w:space="0" w:color="8A8A8A"/>
+            </w:tcBorders>
+            <w:shd w:val="clear" w:color="auto" w:fill="D9EAF7"/>
+            <w:tcMar>
+              <w:top w:w="100" w:type="dxa"/>
+              <w:left w:w="100" w:type="dxa"/>
+              <w:bottom w:w="100" w:type="dxa"/>
+              <w:right w:w="100" w:type="dxa"/>
+            </w:tcMar>
+            <w:hideMark/>
+          </w:tcPr>
+          <w:p>
+            <w:r>
+              <w:t>FAILOVER_IN_PROGRESS</w:t>
+            </w:r>
+          </w:p>
+        </w:tc>
+        <w:tc>
+          <w:tcPr>
+            <w:tcW w:w="1285" w:type="auto"/>
+            <w:tcBorders>
+              <w:top w:val="single" w:sz="6" w:space="0" w:color="8A8A8A"/>
+              <w:left w:val="single" w:sz="6" w:space="0" w:color="8A8A8A"/>
+              <w:bottom w:val="single" w:sz="6" w:space="0" w:color="8A8A8A"/>
+              <w:right w:val="single" w:sz="6" w:space="0" w:color="8A8A8A"/>
+            </w:tcBorders>
+            <w:shd w:val="clear" w:color="auto" w:fill="D9EAF7"/>
+            <w:tcMar>
+              <w:top w:w="100" w:type="dxa"/>
+              <w:left w:w="100" w:type="dxa"/>
+              <w:bottom w:w="100" w:type="dxa"/>
+              <w:right w:w="100" w:type="dxa"/>
+            </w:tcMar>
+            <w:hideMark/>
+          </w:tcPr>
+          <w:p>
+            <w:r>
+              <w:t>INV</w:t>
+            </w:r>
+          </w:p>
+        </w:tc>
+        <w:tc>
+          <w:tcPr>
+            <w:tcW w:w="1285" w:type="auto"/>
+            <w:tcBorders>
+              <w:top w:val="single" w:sz="6" w:space="0" w:color="8A8A8A"/>
+              <w:left w:val="single" w:sz="6" w:space="0" w:color="8A8A8A"/>
+              <w:bottom w:val="single" w:sz="6" w:space="0" w:color="8A8A8A"/>
+              <w:right w:val="single" w:sz="6" w:space="0" w:color="8A8A8A"/>
+            </w:tcBorders>
+            <w:shd w:val="clear" w:color="auto" w:fill="D9EAF7"/>
+            <w:tcMar>
+              <w:top w:w="100" w:type="dxa"/>
+              <w:left w:w="100" w:type="dxa"/>
+              <w:bottom w:w="100" w:type="dxa"/>
+              <w:right w:w="100" w:type="dxa"/>
+            </w:tcMar>
+            <w:hideMark/>
+          </w:tcPr>
+          <w:p>
+            <w:r>
+              <w:t>V</w:t>
+            </w:r>
+          </w:p>
+        </w:tc>
+        <w:tc>
+          <w:tcPr>
+            <w:tcW w:w="1285" w:type="auto"/>
+            <w:tcBorders>
+              <w:top w:val="single" w:sz="6" w:space="0" w:color="8A8A8A"/>
+              <w:left w:val="single" w:sz="6" w:space="0" w:color="8A8A8A"/>
+              <w:bottom w:val="single" w:sz="6" w:space="0" w:color="8A8A8A"/>
+              <w:right w:val="single" w:sz="6" w:space="0" w:color="8A8A8A"/>
+            </w:tcBorders>
+            <w:shd w:val="clear" w:color="auto" w:fill="D9EAF7"/>
+            <w:tcMar>
+              <w:top w:w="100" w:type="dxa"/>
+              <w:left w:w="100" w:type="dxa"/>
+              <w:bottom w:w="100" w:type="dxa"/>
+              <w:right w:w="100" w:type="dxa"/>
+            </w:tcMar>
+            <w:hideMark/>
+          </w:tcPr>
+          <w:p>
+            <w:r>
+              <w:t>V</w:t>
+            </w:r>
+          </w:p>
+        </w:tc>
+        <w:tc>
+          <w:tcPr>
+            <w:tcW w:w="1285" w:type="auto"/>
+            <w:tcBorders>
+              <w:top w:val="single" w:sz="6" w:space="0" w:color="8A8A8A"/>
+              <w:left w:val="single" w:sz="6" w:space="0" w:color="8A8A8A"/>
+              <w:bottom w:val="single" w:sz="6" w:space="0" w:color="8A8A8A"/>
+              <w:right w:val="single" w:sz="6" w:space="0" w:color="8A8A8A"/>
+            </w:tcBorders>
+            <w:shd w:val="clear" w:color="auto" w:fill="D9EAF7"/>
+            <w:tcMar>
+              <w:top w:w="100" w:type="dxa"/>
+              <w:left w:w="100" w:type="dxa"/>
+              <w:bottom w:w="100" w:type="dxa"/>
+              <w:right w:w="100" w:type="dxa"/>
+            </w:tcMar>
+            <w:hideMark/>
+          </w:tcPr>
+          <w:p>
+            <w:r>
+              <w:t>INV</w:t>
+            </w:r>
+          </w:p>
+        </w:tc>
+        <w:tc>
+          <w:tcPr>
+            <w:tcW w:w="1285" w:type="auto"/>
+            <w:tcBorders>
+              <w:top w:val="single" w:sz="6" w:space="0" w:color="8A8A8A"/>
+              <w:left w:val="single" w:sz="6" w:space="0" w:color="8A8A8A"/>
+              <w:bottom w:val="single" w:sz="6" w:space="0" w:color="8A8A8A"/>
+              <w:right w:val="single" w:sz="6" w:space="0" w:color="8A8A8A"/>
+            </w:tcBorders>
+            <w:shd w:val="clear" w:color="auto" w:fill="D9EAF7"/>
+            <w:tcMar>
+              <w:top w:w="100" w:type="dxa"/>
+              <w:left w:w="100" w:type="dxa"/>
+              <w:bottom w:w="100" w:type="dxa"/>
+              <w:right w:w="100" w:type="dxa"/>
+            </w:tcMar>
+            <w:hideMark/>
+          </w:tcPr>
+          <w:p>
+            <w:r>
+              <w:t>INV</w:t>
+            </w:r>
+          </w:p>
+        </w:tc>
+        <w:tc>
+          <w:tcPr>
+            <w:tcW w:w="1285" w:type="auto"/>
+            <w:tcBorders>
+              <w:top w:val="single" w:sz="6" w:space="0" w:color="8A8A8A"/>
+              <w:left w:val="single" w:sz="6" w:space="0" w:color="8A8A8A"/>
+              <w:bottom w:val="single" w:sz="6" w:space="0" w:color="8A8A8A"/>
+              <w:right w:val="single" w:sz="6" w:space="0" w:color="8A8A8A"/>
+            </w:tcBorders>
+            <w:shd w:val="clear" w:color="auto" w:fill="D9EAF7"/>
+            <w:tcMar>
+              <w:top w:w="100" w:type="dxa"/>
+              <w:left w:w="100" w:type="dxa"/>
+              <w:bottom w:w="100" w:type="dxa"/>
+              <w:right w:w="100" w:type="dxa"/>
+            </w:tcMar>
+            <w:hideMark/>
+          </w:tcPr>
+          <w:p>
+            <w:r>
+              <w:t>INV</w:t>
+            </w:r>
+          </w:p>
+        </w:tc>
+      </w:tr>
+      <w:tr>
+        <w:tc>
+          <w:tcPr>
+            <w:tcW w:w="1285" w:type="auto"/>
+            <w:tcBorders>
+              <w:top w:val="single" w:sz="6" w:space="0" w:color="8A8A8A"/>
+              <w:left w:val="single" w:sz="6" w:space="0" w:color="8A8A8A"/>
+              <w:bottom w:val="single" w:sz="6" w:space="0" w:color="8A8A8A"/>
+              <w:right w:val="single" w:sz="6" w:space="0" w:color="8A8A8A"/>
+            </w:tcBorders>
+            <w:shd w:val="clear" w:color="auto" w:fill="D9EAF7"/>
+            <w:tcMar>
+              <w:top w:w="100" w:type="dxa"/>
+              <w:left w:w="100" w:type="dxa"/>
+              <w:bottom w:w="100" w:type="dxa"/>
+              <w:right w:w="100" w:type="dxa"/>
+            </w:tcMar>
+            <w:hideMark/>
+          </w:tcPr>
+          <w:p>
+            <w:r>
+              <w:t>SECONDARY_ACTIVE</w:t>
+            </w:r>
+          </w:p>
+        </w:tc>
+        <w:tc>
+          <w:tcPr>
+            <w:tcW w:w="1285" w:type="auto"/>
+            <w:tcBorders>
+              <w:top w:val="single" w:sz="6" w:space="0" w:color="8A8A8A"/>
+              <w:left w:val="single" w:sz="6" w:space="0" w:color="8A8A8A"/>
+              <w:bottom w:val="single" w:sz="6" w:space="0" w:color="8A8A8A"/>
+              <w:right w:val="single" w:sz="6" w:space="0" w:color="8A8A8A"/>
+            </w:tcBorders>
+            <w:shd w:val="clear" w:color="auto" w:fill="D9EAF7"/>
+            <w:tcMar>
+              <w:top w:w="100" w:type="dxa"/>
+              <w:left w:w="100" w:type="dxa"/>
+              <w:bottom w:w="100" w:type="dxa"/>
+              <w:right w:w="100" w:type="dxa"/>
+            </w:tcMar>
+            <w:hideMark/>
+          </w:tcPr>
+          <w:p>
+            <w:r>
+              <w:t>INV</w:t>
+            </w:r>
+          </w:p>
+        </w:tc>
+        <w:tc>
+          <w:tcPr>
+            <w:tcW w:w="1285" w:type="auto"/>
+            <w:tcBorders>
+              <w:top w:val="single" w:sz="6" w:space="0" w:color="8A8A8A"/>
+              <w:left w:val="single" w:sz="6" w:space="0" w:color="8A8A8A"/>
+              <w:bottom w:val="single" w:sz="6" w:space="0" w:color="8A8A8A"/>
+              <w:right w:val="single" w:sz="6" w:space="0" w:color="8A8A8A"/>
+            </w:tcBorders>
+            <w:shd w:val="clear" w:color="auto" w:fill="D9EAF7"/>
+            <w:tcMar>
+              <w:top w:w="100" w:type="dxa"/>
+              <w:left w:w="100" w:type="dxa"/>
+              <w:bottom w:w="100" w:type="dxa"/>
+              <w:right w:w="100" w:type="dxa"/>
+            </w:tcMar>
+            <w:hideMark/>
+          </w:tcPr>
+          <w:p>
+            <w:r>
+              <w:t>INV</w:t>
+            </w:r>
+          </w:p>
+        </w:tc>
+        <w:tc>
+          <w:tcPr>
+            <w:tcW w:w="1285" w:type="auto"/>
+            <w:tcBorders>
+              <w:top w:val="single" w:sz="6" w:space="0" w:color="8A8A8A"/>
+              <w:left w:val="single" w:sz="6" w:space="0" w:color="8A8A8A"/>
+              <w:bottom w:val="single" w:sz="6" w:space="0" w:color="8A8A8A"/>
+              <w:right w:val="single" w:sz="6" w:space="0" w:color="8A8A8A"/>
+            </w:tcBorders>
+            <w:shd w:val="clear" w:color="auto" w:fill="D9EAF7"/>
+            <w:tcMar>
+              <w:top w:w="100" w:type="dxa"/>
+              <w:left w:w="100" w:type="dxa"/>
+              <w:bottom w:w="100" w:type="dxa"/>
+              <w:right w:w="100" w:type="dxa"/>
+            </w:tcMar>
+            <w:hideMark/>
+          </w:tcPr>
+          <w:p>
+            <w:r>
+              <w:t>INV</w:t>
+            </w:r>
+          </w:p>
+        </w:tc>
+        <w:tc>
+          <w:tcPr>
+            <w:tcW w:w="1285" w:type="auto"/>
+            <w:tcBorders>
+              <w:top w:val="single" w:sz="6" w:space="0" w:color="8A8A8A"/>
+              <w:left w:val="single" w:sz="6" w:space="0" w:color="8A8A8A"/>
+              <w:bottom w:val="single" w:sz="6" w:space="0" w:color="8A8A8A"/>
+              <w:right w:val="single" w:sz="6" w:space="0" w:color="8A8A8A"/>
+            </w:tcBorders>
+            <w:shd w:val="clear" w:color="auto" w:fill="D9EAF7"/>
+            <w:tcMar>
+              <w:top w:w="100" w:type="dxa"/>
+              <w:left w:w="100" w:type="dxa"/>
+              <w:bottom w:w="100" w:type="dxa"/>
+              <w:right w:w="100" w:type="dxa"/>
+            </w:tcMar>
+            <w:hideMark/>
+          </w:tcPr>
+          <w:p>
+            <w:r>
+              <w:t>V</w:t>
+            </w:r>
+          </w:p>
+        </w:tc>
+        <w:tc>
+          <w:tcPr>
+            <w:tcW w:w="1285" w:type="auto"/>
+            <w:tcBorders>
+              <w:top w:val="single" w:sz="6" w:space="0" w:color="8A8A8A"/>
+              <w:left w:val="single" w:sz="6" w:space="0" w:color="8A8A8A"/>
+              <w:bottom w:val="single" w:sz="6" w:space="0" w:color="8A8A8A"/>
+              <w:right w:val="single" w:sz="6" w:space="0" w:color="8A8A8A"/>
+            </w:tcBorders>
+            <w:shd w:val="clear" w:color="auto" w:fill="D9EAF7"/>
+            <w:tcMar>
+              <w:top w:w="100" w:type="dxa"/>
+              <w:left w:w="100" w:type="dxa"/>
+              <w:bottom w:w="100" w:type="dxa"/>
+              <w:right w:w="100" w:type="dxa"/>
+            </w:tcMar>
+            <w:hideMark/>
+          </w:tcPr>
+          <w:p>
+            <w:r>
+              <w:t>INV</w:t>
+            </w:r>
+          </w:p>
+        </w:tc>
+        <w:tc>
+          <w:tcPr>
+            <w:tcW w:w="1285" w:type="auto"/>
+            <w:tcBorders>
+              <w:top w:val="single" w:sz="6" w:space="0" w:color="8A8A8A"/>
+              <w:left w:val="single" w:sz="6" w:space="0" w:color="8A8A8A"/>
+              <w:bottom w:val="single" w:sz="6" w:space="0" w:color="8A8A8A"/>
+              <w:right w:val="single" w:sz="6" w:space="0" w:color="8A8A8A"/>
+            </w:tcBorders>
+            <w:shd w:val="clear" w:color="auto" w:fill="D9EAF7"/>
+            <w:tcMar>
+              <w:top w:w="100" w:type="dxa"/>
+              <w:left w:w="100" w:type="dxa"/>
+              <w:bottom w:w="100" w:type="dxa"/>
+              <w:right w:w="100" w:type="dxa"/>
+            </w:tcMar>
+            <w:hideMark/>
+          </w:tcPr>
+          <w:p>
+            <w:r>
+              <w:t>INV</w:t>
+            </w:r>
+          </w:p>
+        </w:tc>
+      </w:tr>
+      <w:tr>
+        <w:tc>
+          <w:tcPr>
+            <w:tcW w:w="1285" w:type="auto"/>
+            <w:tcBorders>
+              <w:top w:val="single" w:sz="6" w:space="0" w:color="8A8A8A"/>
+              <w:left w:val="single" w:sz="6" w:space="0" w:color="8A8A8A"/>
+              <w:bottom w:val="single" w:sz="6" w:space="0" w:color="8A8A8A"/>
+              <w:right w:val="single" w:sz="6" w:space="0" w:color="8A8A8A"/>
+            </w:tcBorders>
+            <w:shd w:val="clear" w:color="auto" w:fill="D9EAF7"/>
+            <w:tcMar>
+              <w:top w:w="100" w:type="dxa"/>
+              <w:left w:w="100" w:type="dxa"/>
+              <w:bottom w:w="100" w:type="dxa"/>
+              <w:right w:w="100" w:type="dxa"/>
+            </w:tcMar>
+            <w:hideMark/>
+          </w:tcPr>
+          <w:p>
+            <w:r>
+              <w:t>FAILBACK_IN_PROGRESS</w:t>
+            </w:r>
+          </w:p>
+        </w:tc>
+        <w:tc>
+          <w:tcPr>
+            <w:tcW w:w="1285" w:type="auto"/>
+            <w:tcBorders>
+              <w:top w:val="single" w:sz="6" w:space="0" w:color="8A8A8A"/>
+              <w:left w:val="single" w:sz="6" w:space="0" w:color="8A8A8A"/>
+              <w:bottom w:val="single" w:sz="6" w:space="0" w:color="8A8A8A"/>
+              <w:right w:val="single" w:sz="6" w:space="0" w:color="8A8A8A"/>
+            </w:tcBorders>
+            <w:shd w:val="clear" w:color="auto" w:fill="D9EAF7"/>
+            <w:tcMar>
+              <w:top w:w="100" w:type="dxa"/>
+              <w:left w:w="100" w:type="dxa"/>
+              <w:bottom w:w="100" w:type="dxa"/>
+              <w:right w:w="100" w:type="dxa"/>
+            </w:tcMar>
+            <w:hideMark/>
+          </w:tcPr>
+          <w:p>
+            <w:r>
+              <w:t>INV</w:t>
+            </w:r>
+          </w:p>
+        </w:tc>
+        <w:tc>
+          <w:tcPr>
+            <w:tcW w:w="1285" w:type="auto"/>
+            <w:tcBorders>
+              <w:top w:val="single" w:sz="6" w:space="0" w:color="8A8A8A"/>
+              <w:left w:val="single" w:sz="6" w:space="0" w:color="8A8A8A"/>
+              <w:bottom w:val="single" w:sz="6" w:space="0" w:color="8A8A8A"/>
+              <w:right w:val="single" w:sz="6" w:space="0" w:color="8A8A8A"/>
+            </w:tcBorders>
+            <w:shd w:val="clear" w:color="auto" w:fill="D9EAF7"/>
+            <w:tcMar>
+              <w:top w:w="100" w:type="dxa"/>
+              <w:left w:w="100" w:type="dxa"/>
+              <w:bottom w:w="100" w:type="dxa"/>
+              <w:right w:w="100" w:type="dxa"/>
+            </w:tcMar>
+            <w:hideMark/>
+          </w:tcPr>
+          <w:p>
+            <w:r>
+              <w:t>INV</w:t>
+            </w:r>
+          </w:p>
+        </w:tc>
+        <w:tc>
+          <w:tcPr>
+            <w:tcW w:w="1285" w:type="auto"/>
+            <w:tcBorders>
+              <w:top w:val="single" w:sz="6" w:space="0" w:color="8A8A8A"/>
+              <w:left w:val="single" w:sz="6" w:space="0" w:color="8A8A8A"/>
+              <w:bottom w:val="single" w:sz="6" w:space="0" w:color="8A8A8A"/>
+              <w:right w:val="single" w:sz="6" w:space="0" w:color="8A8A8A"/>
+            </w:tcBorders>
+            <w:shd w:val="clear" w:color="auto" w:fill="D9EAF7"/>
+            <w:tcMar>
+              <w:top w:w="100" w:type="dxa"/>
+              <w:left w:w="100" w:type="dxa"/>
+              <w:bottom w:w="100" w:type="dxa"/>
+              <w:right w:w="100" w:type="dxa"/>
+            </w:tcMar>
+            <w:hideMark/>
+          </w:tcPr>
+          <w:p>
+            <w:r>
+              <w:t>INV</w:t>
+            </w:r>
+          </w:p>
+        </w:tc>
+        <w:tc>
+          <w:tcPr>
+            <w:tcW w:w="1285" w:type="auto"/>
+            <w:tcBorders>
+              <w:top w:val="single" w:sz="6" w:space="0" w:color="8A8A8A"/>
+              <w:left w:val="single" w:sz="6" w:space="0" w:color="8A8A8A"/>
+              <w:bottom w:val="single" w:sz="6" w:space="0" w:color="8A8A8A"/>
+              <w:right w:val="single" w:sz="6" w:space="0" w:color="8A8A8A"/>
+            </w:tcBorders>
+            <w:shd w:val="clear" w:color="auto" w:fill="D9EAF7"/>
+            <w:tcMar>
+              <w:top w:w="100" w:type="dxa"/>
+              <w:left w:w="100" w:type="dxa"/>
+              <w:bottom w:w="100" w:type="dxa"/>
+              <w:right w:w="100" w:type="dxa"/>
+            </w:tcMar>
+            <w:hideMark/>
+          </w:tcPr>
+          <w:p>
+            <w:r>
+              <w:t>INV</w:t>
+            </w:r>
+          </w:p>
+        </w:tc>
+        <w:tc>
+          <w:tcPr>
+            <w:tcW w:w="1285" w:type="auto"/>
+            <w:tcBorders>
+              <w:top w:val="single" w:sz="6" w:space="0" w:color="8A8A8A"/>
+              <w:left w:val="single" w:sz="6" w:space="0" w:color="8A8A8A"/>
+              <w:bottom w:val="single" w:sz="6" w:space="0" w:color="8A8A8A"/>
+              <w:right w:val="single" w:sz="6" w:space="0" w:color="8A8A8A"/>
+            </w:tcBorders>
+            <w:shd w:val="clear" w:color="auto" w:fill="D9EAF7"/>
+            <w:tcMar>
+              <w:top w:w="100" w:type="dxa"/>
+              <w:left w:w="100" w:type="dxa"/>
+              <w:bottom w:w="100" w:type="dxa"/>
+              <w:right w:w="100" w:type="dxa"/>
+            </w:tcMar>
+            <w:hideMark/>
+          </w:tcPr>
+          <w:p>
+            <w:r>
+              <w:t>V</w:t>
+            </w:r>
+          </w:p>
+        </w:tc>
+        <w:tc>
+          <w:tcPr>
+            <w:tcW w:w="1285" w:type="auto"/>
+            <w:tcBorders>
+              <w:top w:val="single" w:sz="6" w:space="0" w:color="8A8A8A"/>
+              <w:left w:val="single" w:sz="6" w:space="0" w:color="8A8A8A"/>
+              <w:bottom w:val="single" w:sz="6" w:space="0" w:color="8A8A8A"/>
+              <w:right w:val="single" w:sz="6" w:space="0" w:color="8A8A8A"/>
+            </w:tcBorders>
+            <w:shd w:val="clear" w:color="auto" w:fill="D9EAF7"/>
+            <w:tcMar>
+              <w:top w:w="100" w:type="dxa"/>
+              <w:left w:w="100" w:type="dxa"/>
+              <w:bottom w:w="100" w:type="dxa"/>
+              <w:right w:w="100" w:type="dxa"/>
+            </w:tcMar>
+            <w:hideMark/>
+          </w:tcPr>
+          <w:p>
+            <w:r>
+              <w:t>V</w:t>
+            </w:r>
+          </w:p>
+        </w:tc>
+      </w:tr>
+    </w:tbl>
+    <w:p>
+      <w:r>
+        <w:t xml:space="preserve"> </w:t>
+      </w:r>
+    </w:p>
+    <w:p>
+      <w:r>
+        <w:t>Additional Unit Tests</w:t>
+      </w:r>
+    </w:p>
+    <w:tbl>
+      <w:tblPr>
+        <w:tblW w:w="0" w:type="auto"/>
+        <w:tblCellMar>
+          <w:top w:w="15" w:type="dxa"/>
+          <w:left w:w="15" w:type="dxa"/>
+          <w:bottom w:w="15" w:type="dxa"/>
+          <w:right w:w="15" w:type="dxa"/>
+        </w:tblCellMar>
+        <w:tblLook w:val="04A0" w:firstRow="1" w:lastRow="0" w:firstColumn="1" w:lastColumn="0" w:noHBand="0" w:noVBand="1"/>
+      </w:tblPr>
+      <w:tblGrid>
+        <w:gridCol w:w="1800"/>
+        <w:gridCol w:w="1800"/>
+        <w:gridCol w:w="1800"/>
+        <w:gridCol w:w="1800"/>
+        <w:gridCol w:w="1800"/>
+      </w:tblGrid>
+      <w:tr>
+        <w:tc>
+          <w:tcPr>
+            <w:tcW w:w="1800" w:type="auto"/>
+            <w:tcBorders>
+              <w:top w:val="single" w:sz="6" w:space="0" w:color="8A8A8A"/>
+              <w:left w:val="single" w:sz="6" w:space="0" w:color="8A8A8A"/>
+              <w:bottom w:val="single" w:sz="6" w:space="0" w:color="8A8A8A"/>
+              <w:right w:val="single" w:sz="6" w:space="0" w:color="8A8A8A"/>
+            </w:tcBorders>
+            <w:shd w:val="clear" w:color="auto" w:fill="D9EAF7"/>
+            <w:tcMar>
+              <w:top w:w="100" w:type="dxa"/>
+              <w:left w:w="100" w:type="dxa"/>
+              <w:bottom w:w="100" w:type="dxa"/>
+              <w:right w:w="100" w:type="dxa"/>
+            </w:tcMar>
+            <w:hideMark/>
+          </w:tcPr>
+          <w:p>
+            <w:r>
+              <w:rPr>
+                <w:b/>
+                <w:bCs/>
+              </w:rPr>
+              <w:t>Test case</w:t>
+            </w:r>
+          </w:p>
+        </w:tc>
+        <w:tc>
+          <w:tcPr>
+            <w:tcW w:w="1800" w:type="auto"/>
+            <w:tcBorders>
+              <w:top w:val="single" w:sz="6" w:space="0" w:color="8A8A8A"/>
+              <w:left w:val="single" w:sz="6" w:space="0" w:color="8A8A8A"/>
+              <w:bottom w:val="single" w:sz="6" w:space="0" w:color="8A8A8A"/>
+              <w:right w:val="single" w:sz="6" w:space="0" w:color="8A8A8A"/>
+            </w:tcBorders>
+            <w:shd w:val="clear" w:color="auto" w:fill="D9EAF7"/>
+            <w:tcMar>
+              <w:top w:w="100" w:type="dxa"/>
+              <w:left w:w="100" w:type="dxa"/>
+              <w:bottom w:w="100" w:type="dxa"/>
+              <w:right w:w="100" w:type="dxa"/>
+            </w:tcMar>
+            <w:hideMark/>
+          </w:tcPr>
+          <w:p>
+            <w:r>
+              <w:rPr>
+                <w:b/>
+                <w:bCs/>
+              </w:rPr>
+              <w:t>Expected result</w:t>
+            </w:r>
+          </w:p>
+        </w:tc>
+        <w:tc>
+          <w:tcPr>
+            <w:tcW w:w="1800" w:type="auto"/>
+            <w:tcBorders>
+              <w:top w:val="single" w:sz="6" w:space="0" w:color="8A8A8A"/>
+              <w:left w:val="single" w:sz="6" w:space="0" w:color="8A8A8A"/>
+              <w:bottom w:val="single" w:sz="6" w:space="0" w:color="8A8A8A"/>
+              <w:right w:val="single" w:sz="6" w:space="0" w:color="8A8A8A"/>
+            </w:tcBorders>
+            <w:shd w:val="clear" w:color="auto" w:fill="D9EAF7"/>
+            <w:tcMar>
+              <w:top w:w="100" w:type="dxa"/>
+              <w:left w:w="100" w:type="dxa"/>
+              <w:bottom w:w="100" w:type="dxa"/>
+              <w:right w:w="100" w:type="dxa"/>
+            </w:tcMar>
+            <w:hideMark/>
+          </w:tcPr>
+          <w:p>
+            <w:r>
+              <w:rPr>
+                <w:b/>
+                <w:bCs/>
+              </w:rPr>
+              <w:t>Reason</w:t>
+            </w:r>
+          </w:p>
+        </w:tc>
+        <w:tc>
+          <w:tcPr>
+            <w:tcW w:w="1800" w:type="auto"/>
+            <w:tcBorders>
+              <w:top w:val="single" w:sz="6" w:space="0" w:color="8A8A8A"/>
+              <w:left w:val="single" w:sz="6" w:space="0" w:color="8A8A8A"/>
+              <w:bottom w:val="single" w:sz="6" w:space="0" w:color="8A8A8A"/>
+              <w:right w:val="single" w:sz="6" w:space="0" w:color="8A8A8A"/>
+            </w:tcBorders>
+            <w:shd w:val="clear" w:color="auto" w:fill="D9EAF7"/>
+            <w:tcMar>
+              <w:top w:w="100" w:type="dxa"/>
+              <w:left w:w="100" w:type="dxa"/>
+              <w:bottom w:w="100" w:type="dxa"/>
+              <w:right w:w="100" w:type="dxa"/>
+            </w:tcMar>
+            <w:hideMark/>
+          </w:tcPr>
+          <w:p>
+            <w:r>
+              <w:rPr>
+                <w:b/>
+                <w:bCs/>
+              </w:rPr>
+              <w:t>Test class</w:t>
+            </w:r>
+          </w:p>
+        </w:tc>
+        <w:tc>
+          <w:tcPr>
+            <w:tcW w:w="1800" w:type="auto"/>
+            <w:tcBorders>
+              <w:top w:val="single" w:sz="6" w:space="0" w:color="8A8A8A"/>
+              <w:left w:val="single" w:sz="6" w:space="0" w:color="8A8A8A"/>
+              <w:bottom w:val="single" w:sz="6" w:space="0" w:color="8A8A8A"/>
+              <w:right w:val="single" w:sz="6" w:space="0" w:color="8A8A8A"/>
+            </w:tcBorders>
+            <w:shd w:val="clear" w:color="auto" w:fill="D9EAF7"/>
+            <w:tcMar>
+              <w:top w:w="100" w:type="dxa"/>
+              <w:left w:w="100" w:type="dxa"/>
+              <w:bottom w:w="100" w:type="dxa"/>
+              <w:right w:w="100" w:type="dxa"/>
+            </w:tcMar>
+            <w:hideMark/>
+          </w:tcPr>
+          <w:p>
+            <w:r>
+              <w:rPr>
+                <w:b/>
+                <w:bCs/>
+              </w:rPr>
+              <w:t>Implemented unit test</w:t>
+            </w:r>
+          </w:p>
+        </w:tc>
+      </w:tr>
+      <w:tr>
+        <w:tc>
+          <w:tcPr>
+            <w:tcW w:w="1800" w:type="auto"/>
+            <w:tcBorders>
+              <w:top w:val="single" w:sz="6" w:space="0" w:color="8A8A8A"/>
+              <w:left w:val="single" w:sz="6" w:space="0" w:color="8A8A8A"/>
+              <w:bottom w:val="single" w:sz="6" w:space="0" w:color="8A8A8A"/>
+              <w:right w:val="single" w:sz="6" w:space="0" w:color="8A8A8A"/>
+            </w:tcBorders>
+            <w:shd w:val="clear" w:color="auto" w:fill="D9EAF7"/>
+            <w:tcMar>
+              <w:top w:w="100" w:type="dxa"/>
+              <w:left w:w="100" w:type="dxa"/>
+              <w:bottom w:w="100" w:type="dxa"/>
+              <w:right w:w="100" w:type="dxa"/>
+            </w:tcMar>
+            <w:hideMark/>
+          </w:tcPr>
+          <w:p>
+            <w:r>
+              <w:t>Abort failback while in progress</w:t>
+            </w:r>
+          </w:p>
+        </w:tc>
+        <w:tc>
+          <w:tcPr>
+            <w:tcW w:w="1800" w:type="auto"/>
+            <w:tcBorders>
+              <w:top w:val="single" w:sz="6" w:space="0" w:color="8A8A8A"/>
+              <w:left w:val="single" w:sz="6" w:space="0" w:color="8A8A8A"/>
+              <w:bottom w:val="single" w:sz="6" w:space="0" w:color="8A8A8A"/>
+              <w:right w:val="single" w:sz="6" w:space="0" w:color="8A8A8A"/>
+            </w:tcBorders>
+            <w:shd w:val="clear" w:color="auto" w:fill="D9EAF7"/>
+            <w:tcMar>
+              <w:top w:w="100" w:type="dxa"/>
+              <w:left w:w="100" w:type="dxa"/>
+              <w:bottom w:w="100" w:type="dxa"/>
+              <w:right w:w="100" w:type="dxa"/>
+            </w:tcMar>
+            <w:hideMark/>
+          </w:tcPr>
+          <w:p>
+            <w:r>
+              <w:t>Returns to SECONDARY_ACTIVE, maintenance mode off</w:t>
+            </w:r>
+          </w:p>
+        </w:tc>
+        <w:tc>
+          <w:tcPr>
+            <w:tcW w:w="1800" w:type="auto"/>
+            <w:tcBorders>
+              <w:top w:val="single" w:sz="6" w:space="0" w:color="8A8A8A"/>
+              <w:left w:val="single" w:sz="6" w:space="0" w:color="8A8A8A"/>
+              <w:bottom w:val="single" w:sz="6" w:space="0" w:color="8A8A8A"/>
+              <w:right w:val="single" w:sz="6" w:space="0" w:color="8A8A8A"/>
+            </w:tcBorders>
+            <w:shd w:val="clear" w:color="auto" w:fill="D9EAF7"/>
+            <w:tcMar>
+              <w:top w:w="100" w:type="dxa"/>
+              <w:left w:w="100" w:type="dxa"/>
+              <w:bottom w:w="100" w:type="dxa"/>
+              <w:right w:w="100" w:type="dxa"/>
+            </w:tcMar>
+            <w:hideMark/>
+          </w:tcPr>
+          <w:p>
+            <w:r>
+              <w:t>Closes the only valid transition not covered previously</w:t>
+            </w:r>
+          </w:p>
+        </w:tc>
+        <w:tc>
+          <w:tcPr>
+            <w:tcW w:w="1800" w:type="auto"/>
+            <w:tcBorders>
+              <w:top w:val="single" w:sz="6" w:space="0" w:color="8A8A8A"/>
+              <w:left w:val="single" w:sz="6" w:space="0" w:color="8A8A8A"/>
+              <w:bottom w:val="single" w:sz="6" w:space="0" w:color="8A8A8A"/>
+              <w:right w:val="single" w:sz="6" w:space="0" w:color="8A8A8A"/>
+            </w:tcBorders>
+            <w:shd w:val="clear" w:color="auto" w:fill="D9EAF7"/>
+            <w:tcMar>
+              <w:top w:w="100" w:type="dxa"/>
+              <w:left w:w="100" w:type="dxa"/>
+              <w:bottom w:w="100" w:type="dxa"/>
+              <w:right w:w="100" w:type="dxa"/>
+            </w:tcMar>
+            <w:hideMark/>
+          </w:tcPr>
+          <w:p>
+            <w:r>
+              <w:t>DatabaseRoutingServiceTest</w:t>
+            </w:r>
+          </w:p>
+        </w:tc>
+        <w:tc>
+          <w:tcPr>
+            <w:tcW w:w="1800" w:type="auto"/>
+            <w:tcBorders>
+              <w:top w:val="single" w:sz="6" w:space="0" w:color="8A8A8A"/>
+              <w:left w:val="single" w:sz="6" w:space="0" w:color="8A8A8A"/>
+              <w:bottom w:val="single" w:sz="6" w:space="0" w:color="8A8A8A"/>
+              <w:right w:val="single" w:sz="6" w:space="0" w:color="8A8A8A"/>
+            </w:tcBorders>
+            <w:shd w:val="clear" w:color="auto" w:fill="D9EAF7"/>
+            <w:tcMar>
+              <w:top w:w="100" w:type="dxa"/>
+              <w:left w:w="100" w:type="dxa"/>
+              <w:bottom w:w="100" w:type="dxa"/>
+              <w:right w:w="100" w:type="dxa"/>
+            </w:tcMar>
+            <w:hideMark/>
+          </w:tcPr>
+          <w:p>
+            <w:r>
+              <w:t>failbackCanBeAbortedWhileInProgress</w:t>
+            </w:r>
+          </w:p>
+        </w:tc>
+      </w:tr>
+      <w:tr>
+        <w:tc>
+          <w:tcPr>
+            <w:tcW w:w="1800" w:type="auto"/>
+            <w:tcBorders>
+              <w:top w:val="single" w:sz="6" w:space="0" w:color="8A8A8A"/>
+              <w:left w:val="single" w:sz="6" w:space="0" w:color="8A8A8A"/>
+              <w:bottom w:val="single" w:sz="6" w:space="0" w:color="8A8A8A"/>
+              <w:right w:val="single" w:sz="6" w:space="0" w:color="8A8A8A"/>
+            </w:tcBorders>
+            <w:shd w:val="clear" w:color="auto" w:fill="D9EAF7"/>
+            <w:tcMar>
+              <w:top w:w="100" w:type="dxa"/>
+              <w:left w:w="100" w:type="dxa"/>
+              <w:bottom w:w="100" w:type="dxa"/>
+              <w:right w:w="100" w:type="dxa"/>
+            </w:tcMar>
+            <w:hideMark/>
+          </w:tcPr>
+          <w:p>
+            <w:r>
+              <w:t>All 18 invalid (state, operation) pairs</w:t>
+            </w:r>
+          </w:p>
+        </w:tc>
+        <w:tc>
+          <w:tcPr>
+            <w:tcW w:w="1800" w:type="auto"/>
+            <w:tcBorders>
+              <w:top w:val="single" w:sz="6" w:space="0" w:color="8A8A8A"/>
+              <w:left w:val="single" w:sz="6" w:space="0" w:color="8A8A8A"/>
+              <w:bottom w:val="single" w:sz="6" w:space="0" w:color="8A8A8A"/>
+              <w:right w:val="single" w:sz="6" w:space="0" w:color="8A8A8A"/>
+            </w:tcBorders>
+            <w:shd w:val="clear" w:color="auto" w:fill="D9EAF7"/>
+            <w:tcMar>
+              <w:top w:w="100" w:type="dxa"/>
+              <w:left w:w="100" w:type="dxa"/>
+              <w:bottom w:w="100" w:type="dxa"/>
+              <w:right w:w="100" w:type="dxa"/>
+            </w:tcMar>
+            <w:hideMark/>
+          </w:tcPr>
+          <w:p>
+            <w:r>
+              <w:t>InvalidDatabaseStateTransitionException, state and role unchanged</w:t>
+            </w:r>
+          </w:p>
+        </w:tc>
+        <w:tc>
+          <w:tcPr>
+            <w:tcW w:w="1800" w:type="auto"/>
+            <w:tcBorders>
+              <w:top w:val="single" w:sz="6" w:space="0" w:color="8A8A8A"/>
+              <w:left w:val="single" w:sz="6" w:space="0" w:color="8A8A8A"/>
+              <w:bottom w:val="single" w:sz="6" w:space="0" w:color="8A8A8A"/>
+              <w:right w:val="single" w:sz="6" w:space="0" w:color="8A8A8A"/>
+            </w:tcBorders>
+            <w:shd w:val="clear" w:color="auto" w:fill="D9EAF7"/>
+            <w:tcMar>
+              <w:top w:w="100" w:type="dxa"/>
+              <w:left w:w="100" w:type="dxa"/>
+              <w:bottom w:w="100" w:type="dxa"/>
+              <w:right w:w="100" w:type="dxa"/>
+            </w:tcMar>
+            <w:hideMark/>
+          </w:tcPr>
+          <w:p>
+            <w:r>
+              <w:t>Parameterized test guarantees state machine completeness</w:t>
+            </w:r>
+          </w:p>
+        </w:tc>
+        <w:tc>
+          <w:tcPr>
+            <w:tcW w:w="1800" w:type="auto"/>
+            <w:tcBorders>
+              <w:top w:val="single" w:sz="6" w:space="0" w:color="8A8A8A"/>
+              <w:left w:val="single" w:sz="6" w:space="0" w:color="8A8A8A"/>
+              <w:bottom w:val="single" w:sz="6" w:space="0" w:color="8A8A8A"/>
+              <w:right w:val="single" w:sz="6" w:space="0" w:color="8A8A8A"/>
+            </w:tcBorders>
+            <w:shd w:val="clear" w:color="auto" w:fill="D9EAF7"/>
+            <w:tcMar>
+              <w:top w:w="100" w:type="dxa"/>
+              <w:left w:w="100" w:type="dxa"/>
+              <w:bottom w:w="100" w:type="dxa"/>
+              <w:right w:w="100" w:type="dxa"/>
+            </w:tcMar>
+            <w:hideMark/>
+          </w:tcPr>
+          <w:p>
+            <w:r>
+              <w:t>DatabaseRoutingServiceTest</w:t>
+            </w:r>
+          </w:p>
+        </w:tc>
+        <w:tc>
+          <w:tcPr>
+            <w:tcW w:w="1800" w:type="auto"/>
+            <w:tcBorders>
+              <w:top w:val="single" w:sz="6" w:space="0" w:color="8A8A8A"/>
+              <w:left w:val="single" w:sz="6" w:space="0" w:color="8A8A8A"/>
+              <w:bottom w:val="single" w:sz="6" w:space="0" w:color="8A8A8A"/>
+              <w:right w:val="single" w:sz="6" w:space="0" w:color="8A8A8A"/>
+            </w:tcBorders>
+            <w:shd w:val="clear" w:color="auto" w:fill="D9EAF7"/>
+            <w:tcMar>
+              <w:top w:w="100" w:type="dxa"/>
+              <w:left w:w="100" w:type="dxa"/>
+              <w:bottom w:w="100" w:type="dxa"/>
+              <w:right w:w="100" w:type="dxa"/>
+            </w:tcMar>
+            <w:hideMark/>
+          </w:tcPr>
+          <w:p>
+            <w:r>
+              <w:t>invalidStateTransitionIsRejected (parameterized x 18)</w:t>
+            </w:r>
+          </w:p>
+        </w:tc>
+      </w:tr>
+    </w:tbl>
+    <w:p>
+      <w:r>
+        <w:t xml:space="preserve"> </w:t>
+      </w:r>
+    </w:p>
+    <w:p>
       <w:pPr>
         <w:rPr>
           <w:b/>
@@ -18859,6 +20193,2439 @@
     <w:p>
       <w:r>
         <w:br/>
+      </w:r>
+    </w:p>
+    <w:p>
+      <w:r>
+        <w:t>Payload Validation (Equivalence Partitioning)</w:t>
+      </w:r>
+    </w:p>
+    <w:p>
+      <w:r>
+        <w:t>CREATE jobs require six fields (id, username, characterLimit, email, password, role). UPDATE and DELETE jobs only require id. The gateway should throw IllegalArgumentException with a clear message when a required field is missing, ignore jobs for non-account entities silently, and emit no SQL for an UPDATE that has nothing to set.</w:t>
+      </w:r>
+    </w:p>
+    <w:p>
+      <w:r>
+        <w:t>Equivalence Partitions</w:t>
+      </w:r>
+    </w:p>
+    <w:tbl>
+      <w:tblPr>
+        <w:tblW w:w="0" w:type="auto"/>
+        <w:tblCellMar>
+          <w:top w:w="15" w:type="dxa"/>
+          <w:left w:w="15" w:type="dxa"/>
+          <w:bottom w:w="15" w:type="dxa"/>
+          <w:right w:w="15" w:type="dxa"/>
+        </w:tblCellMar>
+        <w:tblLook w:val="04A0" w:firstRow="1" w:lastRow="0" w:firstColumn="1" w:lastColumn="0" w:noHBand="0" w:noVBand="1"/>
+      </w:tblPr>
+      <w:tblGrid>
+        <w:gridCol w:w="3000"/>
+        <w:gridCol w:w="3000"/>
+        <w:gridCol w:w="3000"/>
+      </w:tblGrid>
+      <w:tr>
+        <w:tc>
+          <w:tcPr>
+            <w:tcW w:w="3000" w:type="auto"/>
+            <w:tcBorders>
+              <w:top w:val="single" w:sz="6" w:space="0" w:color="8A8A8A"/>
+              <w:left w:val="single" w:sz="6" w:space="0" w:color="8A8A8A"/>
+              <w:bottom w:val="single" w:sz="6" w:space="0" w:color="8A8A8A"/>
+              <w:right w:val="single" w:sz="6" w:space="0" w:color="8A8A8A"/>
+            </w:tcBorders>
+            <w:shd w:val="clear" w:color="auto" w:fill="D9EAF7"/>
+            <w:tcMar>
+              <w:top w:w="100" w:type="dxa"/>
+              <w:left w:w="100" w:type="dxa"/>
+              <w:bottom w:w="100" w:type="dxa"/>
+              <w:right w:w="100" w:type="dxa"/>
+            </w:tcMar>
+            <w:hideMark/>
+          </w:tcPr>
+          <w:p>
+            <w:r>
+              <w:rPr>
+                <w:b/>
+                <w:bCs/>
+              </w:rPr>
+              <w:t>Partition</w:t>
+            </w:r>
+          </w:p>
+        </w:tc>
+        <w:tc>
+          <w:tcPr>
+            <w:tcW w:w="3000" w:type="auto"/>
+            <w:tcBorders>
+              <w:top w:val="single" w:sz="6" w:space="0" w:color="8A8A8A"/>
+              <w:left w:val="single" w:sz="6" w:space="0" w:color="8A8A8A"/>
+              <w:bottom w:val="single" w:sz="6" w:space="0" w:color="8A8A8A"/>
+              <w:right w:val="single" w:sz="6" w:space="0" w:color="8A8A8A"/>
+            </w:tcBorders>
+            <w:shd w:val="clear" w:color="auto" w:fill="D9EAF7"/>
+            <w:tcMar>
+              <w:top w:w="100" w:type="dxa"/>
+              <w:left w:w="100" w:type="dxa"/>
+              <w:bottom w:w="100" w:type="dxa"/>
+              <w:right w:w="100" w:type="dxa"/>
+            </w:tcMar>
+            <w:hideMark/>
+          </w:tcPr>
+          <w:p>
+            <w:r>
+              <w:rPr>
+                <w:b/>
+                <w:bCs/>
+              </w:rPr>
+              <w:t>Job characteristics</w:t>
+            </w:r>
+          </w:p>
+        </w:tc>
+        <w:tc>
+          <w:tcPr>
+            <w:tcW w:w="3000" w:type="auto"/>
+            <w:tcBorders>
+              <w:top w:val="single" w:sz="6" w:space="0" w:color="8A8A8A"/>
+              <w:left w:val="single" w:sz="6" w:space="0" w:color="8A8A8A"/>
+              <w:bottom w:val="single" w:sz="6" w:space="0" w:color="8A8A8A"/>
+              <w:right w:val="single" w:sz="6" w:space="0" w:color="8A8A8A"/>
+            </w:tcBorders>
+            <w:shd w:val="clear" w:color="auto" w:fill="D9EAF7"/>
+            <w:tcMar>
+              <w:top w:w="100" w:type="dxa"/>
+              <w:left w:w="100" w:type="dxa"/>
+              <w:bottom w:w="100" w:type="dxa"/>
+              <w:right w:w="100" w:type="dxa"/>
+            </w:tcMar>
+            <w:hideMark/>
+          </w:tcPr>
+          <w:p>
+            <w:r>
+              <w:rPr>
+                <w:b/>
+                <w:bCs/>
+              </w:rPr>
+              <w:t>Expected behavior</w:t>
+            </w:r>
+          </w:p>
+        </w:tc>
+      </w:tr>
+      <w:tr>
+        <w:tc>
+          <w:tcPr>
+            <w:tcW w:w="3000" w:type="auto"/>
+            <w:tcBorders>
+              <w:top w:val="single" w:sz="6" w:space="0" w:color="8A8A8A"/>
+              <w:left w:val="single" w:sz="6" w:space="0" w:color="8A8A8A"/>
+              <w:bottom w:val="single" w:sz="6" w:space="0" w:color="8A8A8A"/>
+              <w:right w:val="single" w:sz="6" w:space="0" w:color="8A8A8A"/>
+            </w:tcBorders>
+            <w:shd w:val="clear" w:color="auto" w:fill="D9EAF7"/>
+            <w:tcMar>
+              <w:top w:w="100" w:type="dxa"/>
+              <w:left w:w="100" w:type="dxa"/>
+              <w:bottom w:w="100" w:type="dxa"/>
+              <w:right w:w="100" w:type="dxa"/>
+            </w:tcMar>
+            <w:hideMark/>
+          </w:tcPr>
+          <w:p>
+            <w:r>
+              <w:t>Valid CREATE</w:t>
+            </w:r>
+          </w:p>
+        </w:tc>
+        <w:tc>
+          <w:tcPr>
+            <w:tcW w:w="3000" w:type="auto"/>
+            <w:tcBorders>
+              <w:top w:val="single" w:sz="6" w:space="0" w:color="8A8A8A"/>
+              <w:left w:val="single" w:sz="6" w:space="0" w:color="8A8A8A"/>
+              <w:bottom w:val="single" w:sz="6" w:space="0" w:color="8A8A8A"/>
+              <w:right w:val="single" w:sz="6" w:space="0" w:color="8A8A8A"/>
+            </w:tcBorders>
+            <w:shd w:val="clear" w:color="auto" w:fill="D9EAF7"/>
+            <w:tcMar>
+              <w:top w:w="100" w:type="dxa"/>
+              <w:left w:w="100" w:type="dxa"/>
+              <w:bottom w:w="100" w:type="dxa"/>
+              <w:right w:w="100" w:type="dxa"/>
+            </w:tcMar>
+            <w:hideMark/>
+          </w:tcPr>
+          <w:p>
+            <w:r>
+              <w:t>All 6 required fields present</w:t>
+            </w:r>
+          </w:p>
+        </w:tc>
+        <w:tc>
+          <w:tcPr>
+            <w:tcW w:w="3000" w:type="auto"/>
+            <w:tcBorders>
+              <w:top w:val="single" w:sz="6" w:space="0" w:color="8A8A8A"/>
+              <w:left w:val="single" w:sz="6" w:space="0" w:color="8A8A8A"/>
+              <w:bottom w:val="single" w:sz="6" w:space="0" w:color="8A8A8A"/>
+              <w:right w:val="single" w:sz="6" w:space="0" w:color="8A8A8A"/>
+            </w:tcBorders>
+            <w:shd w:val="clear" w:color="auto" w:fill="D9EAF7"/>
+            <w:tcMar>
+              <w:top w:w="100" w:type="dxa"/>
+              <w:left w:w="100" w:type="dxa"/>
+              <w:bottom w:w="100" w:type="dxa"/>
+              <w:right w:w="100" w:type="dxa"/>
+            </w:tcMar>
+            <w:hideMark/>
+          </w:tcPr>
+          <w:p>
+            <w:r>
+              <w:t>Upsert SQL emitted (covered earlier)</w:t>
+            </w:r>
+          </w:p>
+        </w:tc>
+      </w:tr>
+      <w:tr>
+        <w:tc>
+          <w:tcPr>
+            <w:tcW w:w="3000" w:type="auto"/>
+            <w:tcBorders>
+              <w:top w:val="single" w:sz="6" w:space="0" w:color="8A8A8A"/>
+              <w:left w:val="single" w:sz="6" w:space="0" w:color="8A8A8A"/>
+              <w:bottom w:val="single" w:sz="6" w:space="0" w:color="8A8A8A"/>
+              <w:right w:val="single" w:sz="6" w:space="0" w:color="8A8A8A"/>
+            </w:tcBorders>
+            <w:shd w:val="clear" w:color="auto" w:fill="D9EAF7"/>
+            <w:tcMar>
+              <w:top w:w="100" w:type="dxa"/>
+              <w:left w:w="100" w:type="dxa"/>
+              <w:bottom w:w="100" w:type="dxa"/>
+              <w:right w:w="100" w:type="dxa"/>
+            </w:tcMar>
+            <w:hideMark/>
+          </w:tcPr>
+          <w:p>
+            <w:r>
+              <w:t>Valid UPDATE</w:t>
+            </w:r>
+          </w:p>
+        </w:tc>
+        <w:tc>
+          <w:tcPr>
+            <w:tcW w:w="3000" w:type="auto"/>
+            <w:tcBorders>
+              <w:top w:val="single" w:sz="6" w:space="0" w:color="8A8A8A"/>
+              <w:left w:val="single" w:sz="6" w:space="0" w:color="8A8A8A"/>
+              <w:bottom w:val="single" w:sz="6" w:space="0" w:color="8A8A8A"/>
+              <w:right w:val="single" w:sz="6" w:space="0" w:color="8A8A8A"/>
+            </w:tcBorders>
+            <w:shd w:val="clear" w:color="auto" w:fill="D9EAF7"/>
+            <w:tcMar>
+              <w:top w:w="100" w:type="dxa"/>
+              <w:left w:w="100" w:type="dxa"/>
+              <w:bottom w:w="100" w:type="dxa"/>
+              <w:right w:w="100" w:type="dxa"/>
+            </w:tcMar>
+            <w:hideMark/>
+          </w:tcPr>
+          <w:p>
+            <w:r>
+              <w:t>id plus at least one field</w:t>
+            </w:r>
+          </w:p>
+        </w:tc>
+        <w:tc>
+          <w:tcPr>
+            <w:tcW w:w="3000" w:type="auto"/>
+            <w:tcBorders>
+              <w:top w:val="single" w:sz="6" w:space="0" w:color="8A8A8A"/>
+              <w:left w:val="single" w:sz="6" w:space="0" w:color="8A8A8A"/>
+              <w:bottom w:val="single" w:sz="6" w:space="0" w:color="8A8A8A"/>
+              <w:right w:val="single" w:sz="6" w:space="0" w:color="8A8A8A"/>
+            </w:tcBorders>
+            <w:shd w:val="clear" w:color="auto" w:fill="D9EAF7"/>
+            <w:tcMar>
+              <w:top w:w="100" w:type="dxa"/>
+              <w:left w:w="100" w:type="dxa"/>
+              <w:bottom w:w="100" w:type="dxa"/>
+              <w:right w:w="100" w:type="dxa"/>
+            </w:tcMar>
+            <w:hideMark/>
+          </w:tcPr>
+          <w:p>
+            <w:r>
+              <w:t>UPDATE SQL with provided fields (covered earlier)</w:t>
+            </w:r>
+          </w:p>
+        </w:tc>
+      </w:tr>
+      <w:tr>
+        <w:tc>
+          <w:tcPr>
+            <w:tcW w:w="3000" w:type="auto"/>
+            <w:tcBorders>
+              <w:top w:val="single" w:sz="6" w:space="0" w:color="8A8A8A"/>
+              <w:left w:val="single" w:sz="6" w:space="0" w:color="8A8A8A"/>
+              <w:bottom w:val="single" w:sz="6" w:space="0" w:color="8A8A8A"/>
+              <w:right w:val="single" w:sz="6" w:space="0" w:color="8A8A8A"/>
+            </w:tcBorders>
+            <w:shd w:val="clear" w:color="auto" w:fill="D9EAF7"/>
+            <w:tcMar>
+              <w:top w:w="100" w:type="dxa"/>
+              <w:left w:w="100" w:type="dxa"/>
+              <w:bottom w:w="100" w:type="dxa"/>
+              <w:right w:w="100" w:type="dxa"/>
+            </w:tcMar>
+            <w:hideMark/>
+          </w:tcPr>
+          <w:p>
+            <w:r>
+              <w:t>Valid DELETE</w:t>
+            </w:r>
+          </w:p>
+        </w:tc>
+        <w:tc>
+          <w:tcPr>
+            <w:tcW w:w="3000" w:type="auto"/>
+            <w:tcBorders>
+              <w:top w:val="single" w:sz="6" w:space="0" w:color="8A8A8A"/>
+              <w:left w:val="single" w:sz="6" w:space="0" w:color="8A8A8A"/>
+              <w:bottom w:val="single" w:sz="6" w:space="0" w:color="8A8A8A"/>
+              <w:right w:val="single" w:sz="6" w:space="0" w:color="8A8A8A"/>
+            </w:tcBorders>
+            <w:shd w:val="clear" w:color="auto" w:fill="D9EAF7"/>
+            <w:tcMar>
+              <w:top w:w="100" w:type="dxa"/>
+              <w:left w:w="100" w:type="dxa"/>
+              <w:bottom w:w="100" w:type="dxa"/>
+              <w:right w:w="100" w:type="dxa"/>
+            </w:tcMar>
+            <w:hideMark/>
+          </w:tcPr>
+          <w:p>
+            <w:r>
+              <w:t>id present</w:t>
+            </w:r>
+          </w:p>
+        </w:tc>
+        <w:tc>
+          <w:tcPr>
+            <w:tcW w:w="3000" w:type="auto"/>
+            <w:tcBorders>
+              <w:top w:val="single" w:sz="6" w:space="0" w:color="8A8A8A"/>
+              <w:left w:val="single" w:sz="6" w:space="0" w:color="8A8A8A"/>
+              <w:bottom w:val="single" w:sz="6" w:space="0" w:color="8A8A8A"/>
+              <w:right w:val="single" w:sz="6" w:space="0" w:color="8A8A8A"/>
+            </w:tcBorders>
+            <w:shd w:val="clear" w:color="auto" w:fill="D9EAF7"/>
+            <w:tcMar>
+              <w:top w:w="100" w:type="dxa"/>
+              <w:left w:w="100" w:type="dxa"/>
+              <w:bottom w:w="100" w:type="dxa"/>
+              <w:right w:w="100" w:type="dxa"/>
+            </w:tcMar>
+            <w:hideMark/>
+          </w:tcPr>
+          <w:p>
+            <w:r>
+              <w:t>DELETE SQL emitted (covered earlier)</w:t>
+            </w:r>
+          </w:p>
+        </w:tc>
+      </w:tr>
+      <w:tr>
+        <w:tc>
+          <w:tcPr>
+            <w:tcW w:w="3000" w:type="auto"/>
+            <w:tcBorders>
+              <w:top w:val="single" w:sz="6" w:space="0" w:color="8A8A8A"/>
+              <w:left w:val="single" w:sz="6" w:space="0" w:color="8A8A8A"/>
+              <w:bottom w:val="single" w:sz="6" w:space="0" w:color="8A8A8A"/>
+              <w:right w:val="single" w:sz="6" w:space="0" w:color="8A8A8A"/>
+            </w:tcBorders>
+            <w:shd w:val="clear" w:color="auto" w:fill="D9EAF7"/>
+            <w:tcMar>
+              <w:top w:w="100" w:type="dxa"/>
+              <w:left w:w="100" w:type="dxa"/>
+              <w:bottom w:w="100" w:type="dxa"/>
+              <w:right w:w="100" w:type="dxa"/>
+            </w:tcMar>
+            <w:hideMark/>
+          </w:tcPr>
+          <w:p>
+            <w:r>
+              <w:t>Invalid CREATE</w:t>
+            </w:r>
+          </w:p>
+        </w:tc>
+        <w:tc>
+          <w:tcPr>
+            <w:tcW w:w="3000" w:type="auto"/>
+            <w:tcBorders>
+              <w:top w:val="single" w:sz="6" w:space="0" w:color="8A8A8A"/>
+              <w:left w:val="single" w:sz="6" w:space="0" w:color="8A8A8A"/>
+              <w:bottom w:val="single" w:sz="6" w:space="0" w:color="8A8A8A"/>
+              <w:right w:val="single" w:sz="6" w:space="0" w:color="8A8A8A"/>
+            </w:tcBorders>
+            <w:shd w:val="clear" w:color="auto" w:fill="D9EAF7"/>
+            <w:tcMar>
+              <w:top w:w="100" w:type="dxa"/>
+              <w:left w:w="100" w:type="dxa"/>
+              <w:bottom w:w="100" w:type="dxa"/>
+              <w:right w:w="100" w:type="dxa"/>
+            </w:tcMar>
+            <w:hideMark/>
+          </w:tcPr>
+          <w:p>
+            <w:r>
+              <w:t>Any required field missing</w:t>
+            </w:r>
+          </w:p>
+        </w:tc>
+        <w:tc>
+          <w:tcPr>
+            <w:tcW w:w="3000" w:type="auto"/>
+            <w:tcBorders>
+              <w:top w:val="single" w:sz="6" w:space="0" w:color="8A8A8A"/>
+              <w:left w:val="single" w:sz="6" w:space="0" w:color="8A8A8A"/>
+              <w:bottom w:val="single" w:sz="6" w:space="0" w:color="8A8A8A"/>
+              <w:right w:val="single" w:sz="6" w:space="0" w:color="8A8A8A"/>
+            </w:tcBorders>
+            <w:shd w:val="clear" w:color="auto" w:fill="D9EAF7"/>
+            <w:tcMar>
+              <w:top w:w="100" w:type="dxa"/>
+              <w:left w:w="100" w:type="dxa"/>
+              <w:bottom w:w="100" w:type="dxa"/>
+              <w:right w:w="100" w:type="dxa"/>
+            </w:tcMar>
+            <w:hideMark/>
+          </w:tcPr>
+          <w:p>
+            <w:r>
+              <w:t>IllegalArgumentException mentioning the missing field</w:t>
+            </w:r>
+          </w:p>
+        </w:tc>
+      </w:tr>
+      <w:tr>
+        <w:tc>
+          <w:tcPr>
+            <w:tcW w:w="3000" w:type="auto"/>
+            <w:tcBorders>
+              <w:top w:val="single" w:sz="6" w:space="0" w:color="8A8A8A"/>
+              <w:left w:val="single" w:sz="6" w:space="0" w:color="8A8A8A"/>
+              <w:bottom w:val="single" w:sz="6" w:space="0" w:color="8A8A8A"/>
+              <w:right w:val="single" w:sz="6" w:space="0" w:color="8A8A8A"/>
+            </w:tcBorders>
+            <w:shd w:val="clear" w:color="auto" w:fill="D9EAF7"/>
+            <w:tcMar>
+              <w:top w:w="100" w:type="dxa"/>
+              <w:left w:w="100" w:type="dxa"/>
+              <w:bottom w:w="100" w:type="dxa"/>
+              <w:right w:w="100" w:type="dxa"/>
+            </w:tcMar>
+            <w:hideMark/>
+          </w:tcPr>
+          <w:p>
+            <w:r>
+              <w:t>Invalid UPDATE</w:t>
+            </w:r>
+          </w:p>
+        </w:tc>
+        <w:tc>
+          <w:tcPr>
+            <w:tcW w:w="3000" w:type="auto"/>
+            <w:tcBorders>
+              <w:top w:val="single" w:sz="6" w:space="0" w:color="8A8A8A"/>
+              <w:left w:val="single" w:sz="6" w:space="0" w:color="8A8A8A"/>
+              <w:bottom w:val="single" w:sz="6" w:space="0" w:color="8A8A8A"/>
+              <w:right w:val="single" w:sz="6" w:space="0" w:color="8A8A8A"/>
+            </w:tcBorders>
+            <w:shd w:val="clear" w:color="auto" w:fill="D9EAF7"/>
+            <w:tcMar>
+              <w:top w:w="100" w:type="dxa"/>
+              <w:left w:w="100" w:type="dxa"/>
+              <w:bottom w:w="100" w:type="dxa"/>
+              <w:right w:w="100" w:type="dxa"/>
+            </w:tcMar>
+            <w:hideMark/>
+          </w:tcPr>
+          <w:p>
+            <w:r>
+              <w:t>id missing</w:t>
+            </w:r>
+          </w:p>
+        </w:tc>
+        <w:tc>
+          <w:tcPr>
+            <w:tcW w:w="3000" w:type="auto"/>
+            <w:tcBorders>
+              <w:top w:val="single" w:sz="6" w:space="0" w:color="8A8A8A"/>
+              <w:left w:val="single" w:sz="6" w:space="0" w:color="8A8A8A"/>
+              <w:bottom w:val="single" w:sz="6" w:space="0" w:color="8A8A8A"/>
+              <w:right w:val="single" w:sz="6" w:space="0" w:color="8A8A8A"/>
+            </w:tcBorders>
+            <w:shd w:val="clear" w:color="auto" w:fill="D9EAF7"/>
+            <w:tcMar>
+              <w:top w:w="100" w:type="dxa"/>
+              <w:left w:w="100" w:type="dxa"/>
+              <w:bottom w:w="100" w:type="dxa"/>
+              <w:right w:w="100" w:type="dxa"/>
+            </w:tcMar>
+            <w:hideMark/>
+          </w:tcPr>
+          <w:p>
+            <w:r>
+              <w:t>IllegalArgumentException</w:t>
+            </w:r>
+          </w:p>
+        </w:tc>
+      </w:tr>
+      <w:tr>
+        <w:tc>
+          <w:tcPr>
+            <w:tcW w:w="3000" w:type="auto"/>
+            <w:tcBorders>
+              <w:top w:val="single" w:sz="6" w:space="0" w:color="8A8A8A"/>
+              <w:left w:val="single" w:sz="6" w:space="0" w:color="8A8A8A"/>
+              <w:bottom w:val="single" w:sz="6" w:space="0" w:color="8A8A8A"/>
+              <w:right w:val="single" w:sz="6" w:space="0" w:color="8A8A8A"/>
+            </w:tcBorders>
+            <w:shd w:val="clear" w:color="auto" w:fill="D9EAF7"/>
+            <w:tcMar>
+              <w:top w:w="100" w:type="dxa"/>
+              <w:left w:w="100" w:type="dxa"/>
+              <w:bottom w:w="100" w:type="dxa"/>
+              <w:right w:w="100" w:type="dxa"/>
+            </w:tcMar>
+            <w:hideMark/>
+          </w:tcPr>
+          <w:p>
+            <w:r>
+              <w:t>Invalid DELETE</w:t>
+            </w:r>
+          </w:p>
+        </w:tc>
+        <w:tc>
+          <w:tcPr>
+            <w:tcW w:w="3000" w:type="auto"/>
+            <w:tcBorders>
+              <w:top w:val="single" w:sz="6" w:space="0" w:color="8A8A8A"/>
+              <w:left w:val="single" w:sz="6" w:space="0" w:color="8A8A8A"/>
+              <w:bottom w:val="single" w:sz="6" w:space="0" w:color="8A8A8A"/>
+              <w:right w:val="single" w:sz="6" w:space="0" w:color="8A8A8A"/>
+            </w:tcBorders>
+            <w:shd w:val="clear" w:color="auto" w:fill="D9EAF7"/>
+            <w:tcMar>
+              <w:top w:w="100" w:type="dxa"/>
+              <w:left w:w="100" w:type="dxa"/>
+              <w:bottom w:w="100" w:type="dxa"/>
+              <w:right w:w="100" w:type="dxa"/>
+            </w:tcMar>
+            <w:hideMark/>
+          </w:tcPr>
+          <w:p>
+            <w:r>
+              <w:t>id missing</w:t>
+            </w:r>
+          </w:p>
+        </w:tc>
+        <w:tc>
+          <w:tcPr>
+            <w:tcW w:w="3000" w:type="auto"/>
+            <w:tcBorders>
+              <w:top w:val="single" w:sz="6" w:space="0" w:color="8A8A8A"/>
+              <w:left w:val="single" w:sz="6" w:space="0" w:color="8A8A8A"/>
+              <w:bottom w:val="single" w:sz="6" w:space="0" w:color="8A8A8A"/>
+              <w:right w:val="single" w:sz="6" w:space="0" w:color="8A8A8A"/>
+            </w:tcBorders>
+            <w:shd w:val="clear" w:color="auto" w:fill="D9EAF7"/>
+            <w:tcMar>
+              <w:top w:w="100" w:type="dxa"/>
+              <w:left w:w="100" w:type="dxa"/>
+              <w:bottom w:w="100" w:type="dxa"/>
+              <w:right w:w="100" w:type="dxa"/>
+            </w:tcMar>
+            <w:hideMark/>
+          </w:tcPr>
+          <w:p>
+            <w:r>
+              <w:t>IllegalArgumentException</w:t>
+            </w:r>
+          </w:p>
+        </w:tc>
+      </w:tr>
+      <w:tr>
+        <w:tc>
+          <w:tcPr>
+            <w:tcW w:w="3000" w:type="auto"/>
+            <w:tcBorders>
+              <w:top w:val="single" w:sz="6" w:space="0" w:color="8A8A8A"/>
+              <w:left w:val="single" w:sz="6" w:space="0" w:color="8A8A8A"/>
+              <w:bottom w:val="single" w:sz="6" w:space="0" w:color="8A8A8A"/>
+              <w:right w:val="single" w:sz="6" w:space="0" w:color="8A8A8A"/>
+            </w:tcBorders>
+            <w:shd w:val="clear" w:color="auto" w:fill="D9EAF7"/>
+            <w:tcMar>
+              <w:top w:w="100" w:type="dxa"/>
+              <w:left w:w="100" w:type="dxa"/>
+              <w:bottom w:w="100" w:type="dxa"/>
+              <w:right w:w="100" w:type="dxa"/>
+            </w:tcMar>
+            <w:hideMark/>
+          </w:tcPr>
+          <w:p>
+            <w:r>
+              <w:t>Edge case UPDATE</w:t>
+            </w:r>
+          </w:p>
+        </w:tc>
+        <w:tc>
+          <w:tcPr>
+            <w:tcW w:w="3000" w:type="auto"/>
+            <w:tcBorders>
+              <w:top w:val="single" w:sz="6" w:space="0" w:color="8A8A8A"/>
+              <w:left w:val="single" w:sz="6" w:space="0" w:color="8A8A8A"/>
+              <w:bottom w:val="single" w:sz="6" w:space="0" w:color="8A8A8A"/>
+              <w:right w:val="single" w:sz="6" w:space="0" w:color="8A8A8A"/>
+            </w:tcBorders>
+            <w:shd w:val="clear" w:color="auto" w:fill="D9EAF7"/>
+            <w:tcMar>
+              <w:top w:w="100" w:type="dxa"/>
+              <w:left w:w="100" w:type="dxa"/>
+              <w:bottom w:w="100" w:type="dxa"/>
+              <w:right w:w="100" w:type="dxa"/>
+            </w:tcMar>
+            <w:hideMark/>
+          </w:tcPr>
+          <w:p>
+            <w:r>
+              <w:t>Only id present, nothing to set</w:t>
+            </w:r>
+          </w:p>
+        </w:tc>
+        <w:tc>
+          <w:tcPr>
+            <w:tcW w:w="3000" w:type="auto"/>
+            <w:tcBorders>
+              <w:top w:val="single" w:sz="6" w:space="0" w:color="8A8A8A"/>
+              <w:left w:val="single" w:sz="6" w:space="0" w:color="8A8A8A"/>
+              <w:bottom w:val="single" w:sz="6" w:space="0" w:color="8A8A8A"/>
+              <w:right w:val="single" w:sz="6" w:space="0" w:color="8A8A8A"/>
+            </w:tcBorders>
+            <w:shd w:val="clear" w:color="auto" w:fill="D9EAF7"/>
+            <w:tcMar>
+              <w:top w:w="100" w:type="dxa"/>
+              <w:left w:w="100" w:type="dxa"/>
+              <w:bottom w:w="100" w:type="dxa"/>
+              <w:right w:w="100" w:type="dxa"/>
+            </w:tcMar>
+            <w:hideMark/>
+          </w:tcPr>
+          <w:p>
+            <w:r>
+              <w:t>No SQL emitted (no-op)</w:t>
+            </w:r>
+          </w:p>
+        </w:tc>
+      </w:tr>
+      <w:tr>
+        <w:tc>
+          <w:tcPr>
+            <w:tcW w:w="3000" w:type="auto"/>
+            <w:tcBorders>
+              <w:top w:val="single" w:sz="6" w:space="0" w:color="8A8A8A"/>
+              <w:left w:val="single" w:sz="6" w:space="0" w:color="8A8A8A"/>
+              <w:bottom w:val="single" w:sz="6" w:space="0" w:color="8A8A8A"/>
+              <w:right w:val="single" w:sz="6" w:space="0" w:color="8A8A8A"/>
+            </w:tcBorders>
+            <w:shd w:val="clear" w:color="auto" w:fill="D9EAF7"/>
+            <w:tcMar>
+              <w:top w:w="100" w:type="dxa"/>
+              <w:left w:w="100" w:type="dxa"/>
+              <w:bottom w:w="100" w:type="dxa"/>
+              <w:right w:w="100" w:type="dxa"/>
+            </w:tcMar>
+            <w:hideMark/>
+          </w:tcPr>
+          <w:p>
+            <w:r>
+              <w:t>Out-of-scope</w:t>
+            </w:r>
+          </w:p>
+        </w:tc>
+        <w:tc>
+          <w:tcPr>
+            <w:tcW w:w="3000" w:type="auto"/>
+            <w:tcBorders>
+              <w:top w:val="single" w:sz="6" w:space="0" w:color="8A8A8A"/>
+              <w:left w:val="single" w:sz="6" w:space="0" w:color="8A8A8A"/>
+              <w:bottom w:val="single" w:sz="6" w:space="0" w:color="8A8A8A"/>
+              <w:right w:val="single" w:sz="6" w:space="0" w:color="8A8A8A"/>
+            </w:tcBorders>
+            <w:shd w:val="clear" w:color="auto" w:fill="D9EAF7"/>
+            <w:tcMar>
+              <w:top w:w="100" w:type="dxa"/>
+              <w:left w:w="100" w:type="dxa"/>
+              <w:bottom w:w="100" w:type="dxa"/>
+              <w:right w:w="100" w:type="dxa"/>
+            </w:tcMar>
+            <w:hideMark/>
+          </w:tcPr>
+          <w:p>
+            <w:r>
+              <w:t>Non-account entity name</w:t>
+            </w:r>
+          </w:p>
+        </w:tc>
+        <w:tc>
+          <w:tcPr>
+            <w:tcW w:w="3000" w:type="auto"/>
+            <w:tcBorders>
+              <w:top w:val="single" w:sz="6" w:space="0" w:color="8A8A8A"/>
+              <w:left w:val="single" w:sz="6" w:space="0" w:color="8A8A8A"/>
+              <w:bottom w:val="single" w:sz="6" w:space="0" w:color="8A8A8A"/>
+              <w:right w:val="single" w:sz="6" w:space="0" w:color="8A8A8A"/>
+            </w:tcBorders>
+            <w:shd w:val="clear" w:color="auto" w:fill="D9EAF7"/>
+            <w:tcMar>
+              <w:top w:w="100" w:type="dxa"/>
+              <w:left w:w="100" w:type="dxa"/>
+              <w:bottom w:w="100" w:type="dxa"/>
+              <w:right w:w="100" w:type="dxa"/>
+            </w:tcMar>
+            <w:hideMark/>
+          </w:tcPr>
+          <w:p>
+            <w:r>
+              <w:t>Silently ignored (phase 1)</w:t>
+            </w:r>
+          </w:p>
+        </w:tc>
+      </w:tr>
+    </w:tbl>
+    <w:p>
+      <w:r>
+        <w:t xml:space="preserve"> </w:t>
+      </w:r>
+    </w:p>
+    <w:p>
+      <w:r>
+        <w:t>Additional Unit Tests</w:t>
+      </w:r>
+    </w:p>
+    <w:tbl>
+      <w:tblPr>
+        <w:tblW w:w="0" w:type="auto"/>
+        <w:tblCellMar>
+          <w:top w:w="15" w:type="dxa"/>
+          <w:left w:w="15" w:type="dxa"/>
+          <w:bottom w:w="15" w:type="dxa"/>
+          <w:right w:w="15" w:type="dxa"/>
+        </w:tblCellMar>
+        <w:tblLook w:val="04A0" w:firstRow="1" w:lastRow="0" w:firstColumn="1" w:lastColumn="0" w:noHBand="0" w:noVBand="1"/>
+      </w:tblPr>
+      <w:tblGrid>
+        <w:gridCol w:w="1800"/>
+        <w:gridCol w:w="1800"/>
+        <w:gridCol w:w="1800"/>
+        <w:gridCol w:w="1800"/>
+        <w:gridCol w:w="1800"/>
+      </w:tblGrid>
+      <w:tr>
+        <w:tc>
+          <w:tcPr>
+            <w:tcW w:w="1800" w:type="auto"/>
+            <w:tcBorders>
+              <w:top w:val="single" w:sz="6" w:space="0" w:color="8A8A8A"/>
+              <w:left w:val="single" w:sz="6" w:space="0" w:color="8A8A8A"/>
+              <w:bottom w:val="single" w:sz="6" w:space="0" w:color="8A8A8A"/>
+              <w:right w:val="single" w:sz="6" w:space="0" w:color="8A8A8A"/>
+            </w:tcBorders>
+            <w:shd w:val="clear" w:color="auto" w:fill="D9EAF7"/>
+            <w:tcMar>
+              <w:top w:w="100" w:type="dxa"/>
+              <w:left w:w="100" w:type="dxa"/>
+              <w:bottom w:w="100" w:type="dxa"/>
+              <w:right w:w="100" w:type="dxa"/>
+            </w:tcMar>
+            <w:hideMark/>
+          </w:tcPr>
+          <w:p>
+            <w:r>
+              <w:rPr>
+                <w:b/>
+                <w:bCs/>
+              </w:rPr>
+              <w:t>Test case</w:t>
+            </w:r>
+          </w:p>
+        </w:tc>
+        <w:tc>
+          <w:tcPr>
+            <w:tcW w:w="1800" w:type="auto"/>
+            <w:tcBorders>
+              <w:top w:val="single" w:sz="6" w:space="0" w:color="8A8A8A"/>
+              <w:left w:val="single" w:sz="6" w:space="0" w:color="8A8A8A"/>
+              <w:bottom w:val="single" w:sz="6" w:space="0" w:color="8A8A8A"/>
+              <w:right w:val="single" w:sz="6" w:space="0" w:color="8A8A8A"/>
+            </w:tcBorders>
+            <w:shd w:val="clear" w:color="auto" w:fill="D9EAF7"/>
+            <w:tcMar>
+              <w:top w:w="100" w:type="dxa"/>
+              <w:left w:w="100" w:type="dxa"/>
+              <w:bottom w:w="100" w:type="dxa"/>
+              <w:right w:w="100" w:type="dxa"/>
+            </w:tcMar>
+            <w:hideMark/>
+          </w:tcPr>
+          <w:p>
+            <w:r>
+              <w:rPr>
+                <w:b/>
+                <w:bCs/>
+              </w:rPr>
+              <w:t>Expected result</w:t>
+            </w:r>
+          </w:p>
+        </w:tc>
+        <w:tc>
+          <w:tcPr>
+            <w:tcW w:w="1800" w:type="auto"/>
+            <w:tcBorders>
+              <w:top w:val="single" w:sz="6" w:space="0" w:color="8A8A8A"/>
+              <w:left w:val="single" w:sz="6" w:space="0" w:color="8A8A8A"/>
+              <w:bottom w:val="single" w:sz="6" w:space="0" w:color="8A8A8A"/>
+              <w:right w:val="single" w:sz="6" w:space="0" w:color="8A8A8A"/>
+            </w:tcBorders>
+            <w:shd w:val="clear" w:color="auto" w:fill="D9EAF7"/>
+            <w:tcMar>
+              <w:top w:w="100" w:type="dxa"/>
+              <w:left w:w="100" w:type="dxa"/>
+              <w:bottom w:w="100" w:type="dxa"/>
+              <w:right w:w="100" w:type="dxa"/>
+            </w:tcMar>
+            <w:hideMark/>
+          </w:tcPr>
+          <w:p>
+            <w:r>
+              <w:rPr>
+                <w:b/>
+                <w:bCs/>
+              </w:rPr>
+              <w:t>Reason</w:t>
+            </w:r>
+          </w:p>
+        </w:tc>
+        <w:tc>
+          <w:tcPr>
+            <w:tcW w:w="1800" w:type="auto"/>
+            <w:tcBorders>
+              <w:top w:val="single" w:sz="6" w:space="0" w:color="8A8A8A"/>
+              <w:left w:val="single" w:sz="6" w:space="0" w:color="8A8A8A"/>
+              <w:bottom w:val="single" w:sz="6" w:space="0" w:color="8A8A8A"/>
+              <w:right w:val="single" w:sz="6" w:space="0" w:color="8A8A8A"/>
+            </w:tcBorders>
+            <w:shd w:val="clear" w:color="auto" w:fill="D9EAF7"/>
+            <w:tcMar>
+              <w:top w:w="100" w:type="dxa"/>
+              <w:left w:w="100" w:type="dxa"/>
+              <w:bottom w:w="100" w:type="dxa"/>
+              <w:right w:w="100" w:type="dxa"/>
+            </w:tcMar>
+            <w:hideMark/>
+          </w:tcPr>
+          <w:p>
+            <w:r>
+              <w:rPr>
+                <w:b/>
+                <w:bCs/>
+              </w:rPr>
+              <w:t>Test class</w:t>
+            </w:r>
+          </w:p>
+        </w:tc>
+        <w:tc>
+          <w:tcPr>
+            <w:tcW w:w="1800" w:type="auto"/>
+            <w:tcBorders>
+              <w:top w:val="single" w:sz="6" w:space="0" w:color="8A8A8A"/>
+              <w:left w:val="single" w:sz="6" w:space="0" w:color="8A8A8A"/>
+              <w:bottom w:val="single" w:sz="6" w:space="0" w:color="8A8A8A"/>
+              <w:right w:val="single" w:sz="6" w:space="0" w:color="8A8A8A"/>
+            </w:tcBorders>
+            <w:shd w:val="clear" w:color="auto" w:fill="D9EAF7"/>
+            <w:tcMar>
+              <w:top w:w="100" w:type="dxa"/>
+              <w:left w:w="100" w:type="dxa"/>
+              <w:bottom w:w="100" w:type="dxa"/>
+              <w:right w:w="100" w:type="dxa"/>
+            </w:tcMar>
+            <w:hideMark/>
+          </w:tcPr>
+          <w:p>
+            <w:r>
+              <w:rPr>
+                <w:b/>
+                <w:bCs/>
+              </w:rPr>
+              <w:t>Implemented unit test</w:t>
+            </w:r>
+          </w:p>
+        </w:tc>
+      </w:tr>
+      <w:tr>
+        <w:tc>
+          <w:tcPr>
+            <w:tcW w:w="1800" w:type="auto"/>
+            <w:tcBorders>
+              <w:top w:val="single" w:sz="6" w:space="0" w:color="8A8A8A"/>
+              <w:left w:val="single" w:sz="6" w:space="0" w:color="8A8A8A"/>
+              <w:bottom w:val="single" w:sz="6" w:space="0" w:color="8A8A8A"/>
+              <w:right w:val="single" w:sz="6" w:space="0" w:color="8A8A8A"/>
+            </w:tcBorders>
+            <w:shd w:val="clear" w:color="auto" w:fill="D9EAF7"/>
+            <w:tcMar>
+              <w:top w:w="100" w:type="dxa"/>
+              <w:left w:w="100" w:type="dxa"/>
+              <w:bottom w:w="100" w:type="dxa"/>
+              <w:right w:w="100" w:type="dxa"/>
+            </w:tcMar>
+            <w:hideMark/>
+          </w:tcPr>
+          <w:p>
+            <w:r>
+              <w:t>CREATE with each required field missing</w:t>
+            </w:r>
+          </w:p>
+        </w:tc>
+        <w:tc>
+          <w:tcPr>
+            <w:tcW w:w="1800" w:type="auto"/>
+            <w:tcBorders>
+              <w:top w:val="single" w:sz="6" w:space="0" w:color="8A8A8A"/>
+              <w:left w:val="single" w:sz="6" w:space="0" w:color="8A8A8A"/>
+              <w:bottom w:val="single" w:sz="6" w:space="0" w:color="8A8A8A"/>
+              <w:right w:val="single" w:sz="6" w:space="0" w:color="8A8A8A"/>
+            </w:tcBorders>
+            <w:shd w:val="clear" w:color="auto" w:fill="D9EAF7"/>
+            <w:tcMar>
+              <w:top w:w="100" w:type="dxa"/>
+              <w:left w:w="100" w:type="dxa"/>
+              <w:bottom w:w="100" w:type="dxa"/>
+              <w:right w:w="100" w:type="dxa"/>
+            </w:tcMar>
+            <w:hideMark/>
+          </w:tcPr>
+          <w:p>
+            <w:r>
+              <w:t>IllegalArgumentException with field name in message</w:t>
+            </w:r>
+          </w:p>
+        </w:tc>
+        <w:tc>
+          <w:tcPr>
+            <w:tcW w:w="1800" w:type="auto"/>
+            <w:tcBorders>
+              <w:top w:val="single" w:sz="6" w:space="0" w:color="8A8A8A"/>
+              <w:left w:val="single" w:sz="6" w:space="0" w:color="8A8A8A"/>
+              <w:bottom w:val="single" w:sz="6" w:space="0" w:color="8A8A8A"/>
+              <w:right w:val="single" w:sz="6" w:space="0" w:color="8A8A8A"/>
+            </w:tcBorders>
+            <w:shd w:val="clear" w:color="auto" w:fill="D9EAF7"/>
+            <w:tcMar>
+              <w:top w:w="100" w:type="dxa"/>
+              <w:left w:w="100" w:type="dxa"/>
+              <w:bottom w:w="100" w:type="dxa"/>
+              <w:right w:w="100" w:type="dxa"/>
+            </w:tcMar>
+            <w:hideMark/>
+          </w:tcPr>
+          <w:p>
+            <w:r>
+              <w:t>Parameterized over all 6 required fields</w:t>
+            </w:r>
+          </w:p>
+        </w:tc>
+        <w:tc>
+          <w:tcPr>
+            <w:tcW w:w="1800" w:type="auto"/>
+            <w:tcBorders>
+              <w:top w:val="single" w:sz="6" w:space="0" w:color="8A8A8A"/>
+              <w:left w:val="single" w:sz="6" w:space="0" w:color="8A8A8A"/>
+              <w:bottom w:val="single" w:sz="6" w:space="0" w:color="8A8A8A"/>
+              <w:right w:val="single" w:sz="6" w:space="0" w:color="8A8A8A"/>
+            </w:tcBorders>
+            <w:shd w:val="clear" w:color="auto" w:fill="D9EAF7"/>
+            <w:tcMar>
+              <w:top w:w="100" w:type="dxa"/>
+              <w:left w:w="100" w:type="dxa"/>
+              <w:bottom w:w="100" w:type="dxa"/>
+              <w:right w:w="100" w:type="dxa"/>
+            </w:tcMar>
+            <w:hideMark/>
+          </w:tcPr>
+          <w:p>
+            <w:r>
+              <w:t>JdbcAccountSecondaryReplicationGatewayTest</w:t>
+            </w:r>
+          </w:p>
+        </w:tc>
+        <w:tc>
+          <w:tcPr>
+            <w:tcW w:w="1800" w:type="auto"/>
+            <w:tcBorders>
+              <w:top w:val="single" w:sz="6" w:space="0" w:color="8A8A8A"/>
+              <w:left w:val="single" w:sz="6" w:space="0" w:color="8A8A8A"/>
+              <w:bottom w:val="single" w:sz="6" w:space="0" w:color="8A8A8A"/>
+              <w:right w:val="single" w:sz="6" w:space="0" w:color="8A8A8A"/>
+            </w:tcBorders>
+            <w:shd w:val="clear" w:color="auto" w:fill="D9EAF7"/>
+            <w:tcMar>
+              <w:top w:w="100" w:type="dxa"/>
+              <w:left w:w="100" w:type="dxa"/>
+              <w:bottom w:w="100" w:type="dxa"/>
+              <w:right w:w="100" w:type="dxa"/>
+            </w:tcMar>
+            <w:hideMark/>
+          </w:tcPr>
+          <w:p>
+            <w:r>
+              <w:t>createAccountWithMissingRequiredFieldShouldThrow (parameterized x 6)</w:t>
+            </w:r>
+          </w:p>
+        </w:tc>
+      </w:tr>
+      <w:tr>
+        <w:tc>
+          <w:tcPr>
+            <w:tcW w:w="1800" w:type="auto"/>
+            <w:tcBorders>
+              <w:top w:val="single" w:sz="6" w:space="0" w:color="8A8A8A"/>
+              <w:left w:val="single" w:sz="6" w:space="0" w:color="8A8A8A"/>
+              <w:bottom w:val="single" w:sz="6" w:space="0" w:color="8A8A8A"/>
+              <w:right w:val="single" w:sz="6" w:space="0" w:color="8A8A8A"/>
+            </w:tcBorders>
+            <w:shd w:val="clear" w:color="auto" w:fill="D9EAF7"/>
+            <w:tcMar>
+              <w:top w:w="100" w:type="dxa"/>
+              <w:left w:w="100" w:type="dxa"/>
+              <w:bottom w:w="100" w:type="dxa"/>
+              <w:right w:w="100" w:type="dxa"/>
+            </w:tcMar>
+            <w:hideMark/>
+          </w:tcPr>
+          <w:p>
+            <w:r>
+              <w:t>UPDATE without id</w:t>
+            </w:r>
+          </w:p>
+        </w:tc>
+        <w:tc>
+          <w:tcPr>
+            <w:tcW w:w="1800" w:type="auto"/>
+            <w:tcBorders>
+              <w:top w:val="single" w:sz="6" w:space="0" w:color="8A8A8A"/>
+              <w:left w:val="single" w:sz="6" w:space="0" w:color="8A8A8A"/>
+              <w:bottom w:val="single" w:sz="6" w:space="0" w:color="8A8A8A"/>
+              <w:right w:val="single" w:sz="6" w:space="0" w:color="8A8A8A"/>
+            </w:tcBorders>
+            <w:shd w:val="clear" w:color="auto" w:fill="D9EAF7"/>
+            <w:tcMar>
+              <w:top w:w="100" w:type="dxa"/>
+              <w:left w:w="100" w:type="dxa"/>
+              <w:bottom w:w="100" w:type="dxa"/>
+              <w:right w:w="100" w:type="dxa"/>
+            </w:tcMar>
+            <w:hideMark/>
+          </w:tcPr>
+          <w:p>
+            <w:r>
+              <w:t>IllegalArgumentException</w:t>
+            </w:r>
+          </w:p>
+        </w:tc>
+        <w:tc>
+          <w:tcPr>
+            <w:tcW w:w="1800" w:type="auto"/>
+            <w:tcBorders>
+              <w:top w:val="single" w:sz="6" w:space="0" w:color="8A8A8A"/>
+              <w:left w:val="single" w:sz="6" w:space="0" w:color="8A8A8A"/>
+              <w:bottom w:val="single" w:sz="6" w:space="0" w:color="8A8A8A"/>
+              <w:right w:val="single" w:sz="6" w:space="0" w:color="8A8A8A"/>
+            </w:tcBorders>
+            <w:shd w:val="clear" w:color="auto" w:fill="D9EAF7"/>
+            <w:tcMar>
+              <w:top w:w="100" w:type="dxa"/>
+              <w:left w:w="100" w:type="dxa"/>
+              <w:bottom w:w="100" w:type="dxa"/>
+              <w:right w:w="100" w:type="dxa"/>
+            </w:tcMar>
+            <w:hideMark/>
+          </w:tcPr>
+          <w:p>
+            <w:r>
+              <w:t>Verifies id requirement on UPDATE</w:t>
+            </w:r>
+          </w:p>
+        </w:tc>
+        <w:tc>
+          <w:tcPr>
+            <w:tcW w:w="1800" w:type="auto"/>
+            <w:tcBorders>
+              <w:top w:val="single" w:sz="6" w:space="0" w:color="8A8A8A"/>
+              <w:left w:val="single" w:sz="6" w:space="0" w:color="8A8A8A"/>
+              <w:bottom w:val="single" w:sz="6" w:space="0" w:color="8A8A8A"/>
+              <w:right w:val="single" w:sz="6" w:space="0" w:color="8A8A8A"/>
+            </w:tcBorders>
+            <w:shd w:val="clear" w:color="auto" w:fill="D9EAF7"/>
+            <w:tcMar>
+              <w:top w:w="100" w:type="dxa"/>
+              <w:left w:w="100" w:type="dxa"/>
+              <w:bottom w:w="100" w:type="dxa"/>
+              <w:right w:w="100" w:type="dxa"/>
+            </w:tcMar>
+            <w:hideMark/>
+          </w:tcPr>
+          <w:p>
+            <w:r>
+              <w:t>JdbcAccountSecondaryReplicationGatewayTest</w:t>
+            </w:r>
+          </w:p>
+        </w:tc>
+        <w:tc>
+          <w:tcPr>
+            <w:tcW w:w="1800" w:type="auto"/>
+            <w:tcBorders>
+              <w:top w:val="single" w:sz="6" w:space="0" w:color="8A8A8A"/>
+              <w:left w:val="single" w:sz="6" w:space="0" w:color="8A8A8A"/>
+              <w:bottom w:val="single" w:sz="6" w:space="0" w:color="8A8A8A"/>
+              <w:right w:val="single" w:sz="6" w:space="0" w:color="8A8A8A"/>
+            </w:tcBorders>
+            <w:shd w:val="clear" w:color="auto" w:fill="D9EAF7"/>
+            <w:tcMar>
+              <w:top w:w="100" w:type="dxa"/>
+              <w:left w:w="100" w:type="dxa"/>
+              <w:bottom w:w="100" w:type="dxa"/>
+              <w:right w:w="100" w:type="dxa"/>
+            </w:tcMar>
+            <w:hideMark/>
+          </w:tcPr>
+          <w:p>
+            <w:r>
+              <w:t>updateAccountWithoutIdShouldThrow</w:t>
+            </w:r>
+          </w:p>
+        </w:tc>
+      </w:tr>
+      <w:tr>
+        <w:tc>
+          <w:tcPr>
+            <w:tcW w:w="1800" w:type="auto"/>
+            <w:tcBorders>
+              <w:top w:val="single" w:sz="6" w:space="0" w:color="8A8A8A"/>
+              <w:left w:val="single" w:sz="6" w:space="0" w:color="8A8A8A"/>
+              <w:bottom w:val="single" w:sz="6" w:space="0" w:color="8A8A8A"/>
+              <w:right w:val="single" w:sz="6" w:space="0" w:color="8A8A8A"/>
+            </w:tcBorders>
+            <w:shd w:val="clear" w:color="auto" w:fill="D9EAF7"/>
+            <w:tcMar>
+              <w:top w:w="100" w:type="dxa"/>
+              <w:left w:w="100" w:type="dxa"/>
+              <w:bottom w:w="100" w:type="dxa"/>
+              <w:right w:w="100" w:type="dxa"/>
+            </w:tcMar>
+            <w:hideMark/>
+          </w:tcPr>
+          <w:p>
+            <w:r>
+              <w:t>DELETE without id</w:t>
+            </w:r>
+          </w:p>
+        </w:tc>
+        <w:tc>
+          <w:tcPr>
+            <w:tcW w:w="1800" w:type="auto"/>
+            <w:tcBorders>
+              <w:top w:val="single" w:sz="6" w:space="0" w:color="8A8A8A"/>
+              <w:left w:val="single" w:sz="6" w:space="0" w:color="8A8A8A"/>
+              <w:bottom w:val="single" w:sz="6" w:space="0" w:color="8A8A8A"/>
+              <w:right w:val="single" w:sz="6" w:space="0" w:color="8A8A8A"/>
+            </w:tcBorders>
+            <w:shd w:val="clear" w:color="auto" w:fill="D9EAF7"/>
+            <w:tcMar>
+              <w:top w:w="100" w:type="dxa"/>
+              <w:left w:w="100" w:type="dxa"/>
+              <w:bottom w:w="100" w:type="dxa"/>
+              <w:right w:w="100" w:type="dxa"/>
+            </w:tcMar>
+            <w:hideMark/>
+          </w:tcPr>
+          <w:p>
+            <w:r>
+              <w:t>IllegalArgumentException</w:t>
+            </w:r>
+          </w:p>
+        </w:tc>
+        <w:tc>
+          <w:tcPr>
+            <w:tcW w:w="1800" w:type="auto"/>
+            <w:tcBorders>
+              <w:top w:val="single" w:sz="6" w:space="0" w:color="8A8A8A"/>
+              <w:left w:val="single" w:sz="6" w:space="0" w:color="8A8A8A"/>
+              <w:bottom w:val="single" w:sz="6" w:space="0" w:color="8A8A8A"/>
+              <w:right w:val="single" w:sz="6" w:space="0" w:color="8A8A8A"/>
+            </w:tcBorders>
+            <w:shd w:val="clear" w:color="auto" w:fill="D9EAF7"/>
+            <w:tcMar>
+              <w:top w:w="100" w:type="dxa"/>
+              <w:left w:w="100" w:type="dxa"/>
+              <w:bottom w:w="100" w:type="dxa"/>
+              <w:right w:w="100" w:type="dxa"/>
+            </w:tcMar>
+            <w:hideMark/>
+          </w:tcPr>
+          <w:p>
+            <w:r>
+              <w:t>Verifies id requirement on DELETE</w:t>
+            </w:r>
+          </w:p>
+        </w:tc>
+        <w:tc>
+          <w:tcPr>
+            <w:tcW w:w="1800" w:type="auto"/>
+            <w:tcBorders>
+              <w:top w:val="single" w:sz="6" w:space="0" w:color="8A8A8A"/>
+              <w:left w:val="single" w:sz="6" w:space="0" w:color="8A8A8A"/>
+              <w:bottom w:val="single" w:sz="6" w:space="0" w:color="8A8A8A"/>
+              <w:right w:val="single" w:sz="6" w:space="0" w:color="8A8A8A"/>
+            </w:tcBorders>
+            <w:shd w:val="clear" w:color="auto" w:fill="D9EAF7"/>
+            <w:tcMar>
+              <w:top w:w="100" w:type="dxa"/>
+              <w:left w:w="100" w:type="dxa"/>
+              <w:bottom w:w="100" w:type="dxa"/>
+              <w:right w:w="100" w:type="dxa"/>
+            </w:tcMar>
+            <w:hideMark/>
+          </w:tcPr>
+          <w:p>
+            <w:r>
+              <w:t>JdbcAccountSecondaryReplicationGatewayTest</w:t>
+            </w:r>
+          </w:p>
+        </w:tc>
+        <w:tc>
+          <w:tcPr>
+            <w:tcW w:w="1800" w:type="auto"/>
+            <w:tcBorders>
+              <w:top w:val="single" w:sz="6" w:space="0" w:color="8A8A8A"/>
+              <w:left w:val="single" w:sz="6" w:space="0" w:color="8A8A8A"/>
+              <w:bottom w:val="single" w:sz="6" w:space="0" w:color="8A8A8A"/>
+              <w:right w:val="single" w:sz="6" w:space="0" w:color="8A8A8A"/>
+            </w:tcBorders>
+            <w:shd w:val="clear" w:color="auto" w:fill="D9EAF7"/>
+            <w:tcMar>
+              <w:top w:w="100" w:type="dxa"/>
+              <w:left w:w="100" w:type="dxa"/>
+              <w:bottom w:w="100" w:type="dxa"/>
+              <w:right w:w="100" w:type="dxa"/>
+            </w:tcMar>
+            <w:hideMark/>
+          </w:tcPr>
+          <w:p>
+            <w:r>
+              <w:t>deleteAccountWithoutIdShouldThrow</w:t>
+            </w:r>
+          </w:p>
+        </w:tc>
+      </w:tr>
+      <w:tr>
+        <w:tc>
+          <w:tcPr>
+            <w:tcW w:w="1800" w:type="auto"/>
+            <w:tcBorders>
+              <w:top w:val="single" w:sz="6" w:space="0" w:color="8A8A8A"/>
+              <w:left w:val="single" w:sz="6" w:space="0" w:color="8A8A8A"/>
+              <w:bottom w:val="single" w:sz="6" w:space="0" w:color="8A8A8A"/>
+              <w:right w:val="single" w:sz="6" w:space="0" w:color="8A8A8A"/>
+            </w:tcBorders>
+            <w:shd w:val="clear" w:color="auto" w:fill="D9EAF7"/>
+            <w:tcMar>
+              <w:top w:w="100" w:type="dxa"/>
+              <w:left w:w="100" w:type="dxa"/>
+              <w:bottom w:w="100" w:type="dxa"/>
+              <w:right w:w="100" w:type="dxa"/>
+            </w:tcMar>
+            <w:hideMark/>
+          </w:tcPr>
+          <w:p>
+            <w:r>
+              <w:t>UPDATE with only id</w:t>
+            </w:r>
+          </w:p>
+        </w:tc>
+        <w:tc>
+          <w:tcPr>
+            <w:tcW w:w="1800" w:type="auto"/>
+            <w:tcBorders>
+              <w:top w:val="single" w:sz="6" w:space="0" w:color="8A8A8A"/>
+              <w:left w:val="single" w:sz="6" w:space="0" w:color="8A8A8A"/>
+              <w:bottom w:val="single" w:sz="6" w:space="0" w:color="8A8A8A"/>
+              <w:right w:val="single" w:sz="6" w:space="0" w:color="8A8A8A"/>
+            </w:tcBorders>
+            <w:shd w:val="clear" w:color="auto" w:fill="D9EAF7"/>
+            <w:tcMar>
+              <w:top w:w="100" w:type="dxa"/>
+              <w:left w:w="100" w:type="dxa"/>
+              <w:bottom w:w="100" w:type="dxa"/>
+              <w:right w:w="100" w:type="dxa"/>
+            </w:tcMar>
+            <w:hideMark/>
+          </w:tcPr>
+          <w:p>
+            <w:r>
+              <w:t>No SQL emitted</w:t>
+            </w:r>
+          </w:p>
+        </w:tc>
+        <w:tc>
+          <w:tcPr>
+            <w:tcW w:w="1800" w:type="auto"/>
+            <w:tcBorders>
+              <w:top w:val="single" w:sz="6" w:space="0" w:color="8A8A8A"/>
+              <w:left w:val="single" w:sz="6" w:space="0" w:color="8A8A8A"/>
+              <w:bottom w:val="single" w:sz="6" w:space="0" w:color="8A8A8A"/>
+              <w:right w:val="single" w:sz="6" w:space="0" w:color="8A8A8A"/>
+            </w:tcBorders>
+            <w:shd w:val="clear" w:color="auto" w:fill="D9EAF7"/>
+            <w:tcMar>
+              <w:top w:w="100" w:type="dxa"/>
+              <w:left w:w="100" w:type="dxa"/>
+              <w:bottom w:w="100" w:type="dxa"/>
+              <w:right w:w="100" w:type="dxa"/>
+            </w:tcMar>
+            <w:hideMark/>
+          </w:tcPr>
+          <w:p>
+            <w:r>
+              <w:t>Edge case between valid input and no-op</w:t>
+            </w:r>
+          </w:p>
+        </w:tc>
+        <w:tc>
+          <w:tcPr>
+            <w:tcW w:w="1800" w:type="auto"/>
+            <w:tcBorders>
+              <w:top w:val="single" w:sz="6" w:space="0" w:color="8A8A8A"/>
+              <w:left w:val="single" w:sz="6" w:space="0" w:color="8A8A8A"/>
+              <w:bottom w:val="single" w:sz="6" w:space="0" w:color="8A8A8A"/>
+              <w:right w:val="single" w:sz="6" w:space="0" w:color="8A8A8A"/>
+            </w:tcBorders>
+            <w:shd w:val="clear" w:color="auto" w:fill="D9EAF7"/>
+            <w:tcMar>
+              <w:top w:w="100" w:type="dxa"/>
+              <w:left w:w="100" w:type="dxa"/>
+              <w:bottom w:w="100" w:type="dxa"/>
+              <w:right w:w="100" w:type="dxa"/>
+            </w:tcMar>
+            <w:hideMark/>
+          </w:tcPr>
+          <w:p>
+            <w:r>
+              <w:t>JdbcAccountSecondaryReplicationGatewayTest</w:t>
+            </w:r>
+          </w:p>
+        </w:tc>
+        <w:tc>
+          <w:tcPr>
+            <w:tcW w:w="1800" w:type="auto"/>
+            <w:tcBorders>
+              <w:top w:val="single" w:sz="6" w:space="0" w:color="8A8A8A"/>
+              <w:left w:val="single" w:sz="6" w:space="0" w:color="8A8A8A"/>
+              <w:bottom w:val="single" w:sz="6" w:space="0" w:color="8A8A8A"/>
+              <w:right w:val="single" w:sz="6" w:space="0" w:color="8A8A8A"/>
+            </w:tcBorders>
+            <w:shd w:val="clear" w:color="auto" w:fill="D9EAF7"/>
+            <w:tcMar>
+              <w:top w:w="100" w:type="dxa"/>
+              <w:left w:w="100" w:type="dxa"/>
+              <w:bottom w:w="100" w:type="dxa"/>
+              <w:right w:w="100" w:type="dxa"/>
+            </w:tcMar>
+            <w:hideMark/>
+          </w:tcPr>
+          <w:p>
+            <w:r>
+              <w:t>updateAccountWithOnlyIdShouldEmitNoSql</w:t>
+            </w:r>
+          </w:p>
+        </w:tc>
+      </w:tr>
+      <w:tr>
+        <w:tc>
+          <w:tcPr>
+            <w:tcW w:w="1800" w:type="auto"/>
+            <w:tcBorders>
+              <w:top w:val="single" w:sz="6" w:space="0" w:color="8A8A8A"/>
+              <w:left w:val="single" w:sz="6" w:space="0" w:color="8A8A8A"/>
+              <w:bottom w:val="single" w:sz="6" w:space="0" w:color="8A8A8A"/>
+              <w:right w:val="single" w:sz="6" w:space="0" w:color="8A8A8A"/>
+            </w:tcBorders>
+            <w:shd w:val="clear" w:color="auto" w:fill="D9EAF7"/>
+            <w:tcMar>
+              <w:top w:w="100" w:type="dxa"/>
+              <w:left w:w="100" w:type="dxa"/>
+              <w:bottom w:w="100" w:type="dxa"/>
+              <w:right w:w="100" w:type="dxa"/>
+            </w:tcMar>
+            <w:hideMark/>
+          </w:tcPr>
+          <w:p>
+            <w:r>
+              <w:t>Non-account entity</w:t>
+            </w:r>
+          </w:p>
+        </w:tc>
+        <w:tc>
+          <w:tcPr>
+            <w:tcW w:w="1800" w:type="auto"/>
+            <w:tcBorders>
+              <w:top w:val="single" w:sz="6" w:space="0" w:color="8A8A8A"/>
+              <w:left w:val="single" w:sz="6" w:space="0" w:color="8A8A8A"/>
+              <w:bottom w:val="single" w:sz="6" w:space="0" w:color="8A8A8A"/>
+              <w:right w:val="single" w:sz="6" w:space="0" w:color="8A8A8A"/>
+            </w:tcBorders>
+            <w:shd w:val="clear" w:color="auto" w:fill="D9EAF7"/>
+            <w:tcMar>
+              <w:top w:w="100" w:type="dxa"/>
+              <w:left w:w="100" w:type="dxa"/>
+              <w:bottom w:w="100" w:type="dxa"/>
+              <w:right w:w="100" w:type="dxa"/>
+            </w:tcMar>
+            <w:hideMark/>
+          </w:tcPr>
+          <w:p>
+            <w:r>
+              <w:t>No SQL emitted, no exception</w:t>
+            </w:r>
+          </w:p>
+        </w:tc>
+        <w:tc>
+          <w:tcPr>
+            <w:tcW w:w="1800" w:type="auto"/>
+            <w:tcBorders>
+              <w:top w:val="single" w:sz="6" w:space="0" w:color="8A8A8A"/>
+              <w:left w:val="single" w:sz="6" w:space="0" w:color="8A8A8A"/>
+              <w:bottom w:val="single" w:sz="6" w:space="0" w:color="8A8A8A"/>
+              <w:right w:val="single" w:sz="6" w:space="0" w:color="8A8A8A"/>
+            </w:tcBorders>
+            <w:shd w:val="clear" w:color="auto" w:fill="D9EAF7"/>
+            <w:tcMar>
+              <w:top w:w="100" w:type="dxa"/>
+              <w:left w:w="100" w:type="dxa"/>
+              <w:bottom w:w="100" w:type="dxa"/>
+              <w:right w:w="100" w:type="dxa"/>
+            </w:tcMar>
+            <w:hideMark/>
+          </w:tcPr>
+          <w:p>
+            <w:r>
+              <w:t>Out-of-scope partition silently ignored</w:t>
+            </w:r>
+          </w:p>
+        </w:tc>
+        <w:tc>
+          <w:tcPr>
+            <w:tcW w:w="1800" w:type="auto"/>
+            <w:tcBorders>
+              <w:top w:val="single" w:sz="6" w:space="0" w:color="8A8A8A"/>
+              <w:left w:val="single" w:sz="6" w:space="0" w:color="8A8A8A"/>
+              <w:bottom w:val="single" w:sz="6" w:space="0" w:color="8A8A8A"/>
+              <w:right w:val="single" w:sz="6" w:space="0" w:color="8A8A8A"/>
+            </w:tcBorders>
+            <w:shd w:val="clear" w:color="auto" w:fill="D9EAF7"/>
+            <w:tcMar>
+              <w:top w:w="100" w:type="dxa"/>
+              <w:left w:w="100" w:type="dxa"/>
+              <w:bottom w:w="100" w:type="dxa"/>
+              <w:right w:w="100" w:type="dxa"/>
+            </w:tcMar>
+            <w:hideMark/>
+          </w:tcPr>
+          <w:p>
+            <w:r>
+              <w:t>JdbcAccountSecondaryReplicationGatewayTest</w:t>
+            </w:r>
+          </w:p>
+        </w:tc>
+        <w:tc>
+          <w:tcPr>
+            <w:tcW w:w="1800" w:type="auto"/>
+            <w:tcBorders>
+              <w:top w:val="single" w:sz="6" w:space="0" w:color="8A8A8A"/>
+              <w:left w:val="single" w:sz="6" w:space="0" w:color="8A8A8A"/>
+              <w:bottom w:val="single" w:sz="6" w:space="0" w:color="8A8A8A"/>
+              <w:right w:val="single" w:sz="6" w:space="0" w:color="8A8A8A"/>
+            </w:tcBorders>
+            <w:shd w:val="clear" w:color="auto" w:fill="D9EAF7"/>
+            <w:tcMar>
+              <w:top w:w="100" w:type="dxa"/>
+              <w:left w:w="100" w:type="dxa"/>
+              <w:bottom w:w="100" w:type="dxa"/>
+              <w:right w:w="100" w:type="dxa"/>
+            </w:tcMar>
+            <w:hideMark/>
+          </w:tcPr>
+          <w:p>
+            <w:r>
+              <w:t>nonAccountEntityShouldBeIgnoredSilently</w:t>
+            </w:r>
+          </w:p>
+        </w:tc>
+      </w:tr>
+    </w:tbl>
+    <w:p>
+      <w:r>
+        <w:t xml:space="preserve"> </w:t>
+      </w:r>
+    </w:p>
+    <w:p>
+      <w:pPr>
+        <w:rPr>
+          <w:b/>
+          <w:bCs/>
+        </w:rPr>
+      </w:pPr>
+      <w:r>
+        <w:rPr>
+          <w:b/>
+          <w:bCs/>
+        </w:rPr>
+        <w:t>8. Routing Data Source</w:t>
+      </w:r>
+    </w:p>
+    <w:p>
+      <w:r>
+        <w:t>Related class:</w:t>
+      </w:r>
+    </w:p>
+    <w:p>
+      <w:r>
+        <w:t>RoutingDataSource</w:t>
+      </w:r>
+    </w:p>
+    <w:p>
+      <w:r>
+        <w:t>Used:</w:t>
+      </w:r>
+    </w:p>
+    <w:p>
+      <w:r>
+        <w:t>Equivalence Partitioning</w:t>
+      </w:r>
+    </w:p>
+    <w:p>
+      <w:r>
+        <w:t>Testing focuses on whether the AbstractRoutingDataSource subclass picks the correct lookup key based on the current active role reported by DatabaseRoutingService. This is the bridge that makes the failover flag actually change which database receives writes through JPA.</w:t>
+      </w:r>
+    </w:p>
+    <w:p>
+      <w:r>
+        <w:t>The class behavior is:</w:t>
+      </w:r>
+    </w:p>
+    <w:p>
+      <w:r>
+        <w:t>determineCurrentLookupKey returns DatabaseRoutingService.activeRole().</w:t>
+      </w:r>
+    </w:p>
+    <w:p>
+      <w:r>
+        <w:t>When the active role is PRIMARY, JPA connections route to the primary DataSource.</w:t>
+      </w:r>
+    </w:p>
+    <w:p>
+      <w:r>
+        <w:t>When the active role is SECONDARY (after failover), JPA connections route to the secondary DataSource.</w:t>
+      </w:r>
+    </w:p>
+    <w:p>
+      <w:r>
+        <w:t>After failback completes, the active role returns to PRIMARY and so does the routing.</w:t>
+      </w:r>
+    </w:p>
+    <w:p>
+      <w:r>
+        <w:t>Equivalence Partitions</w:t>
+      </w:r>
+    </w:p>
+    <w:tbl>
+      <w:tblPr>
+        <w:tblW w:w="0" w:type="auto"/>
+        <w:tblCellMar>
+          <w:top w:w="15" w:type="dxa"/>
+          <w:left w:w="15" w:type="dxa"/>
+          <w:bottom w:w="15" w:type="dxa"/>
+          <w:right w:w="15" w:type="dxa"/>
+        </w:tblCellMar>
+        <w:tblLook w:val="04A0" w:firstRow="1" w:lastRow="0" w:firstColumn="1" w:lastColumn="0" w:noHBand="0" w:noVBand="1"/>
+      </w:tblPr>
+      <w:tblGrid>
+        <w:gridCol w:w="3000"/>
+        <w:gridCol w:w="3000"/>
+        <w:gridCol w:w="3000"/>
+      </w:tblGrid>
+      <w:tr>
+        <w:tc>
+          <w:tcPr>
+            <w:tcW w:w="3000" w:type="auto"/>
+            <w:tcBorders>
+              <w:top w:val="single" w:sz="6" w:space="0" w:color="8A8A8A"/>
+              <w:left w:val="single" w:sz="6" w:space="0" w:color="8A8A8A"/>
+              <w:bottom w:val="single" w:sz="6" w:space="0" w:color="8A8A8A"/>
+              <w:right w:val="single" w:sz="6" w:space="0" w:color="8A8A8A"/>
+            </w:tcBorders>
+            <w:shd w:val="clear" w:color="auto" w:fill="D9EAF7"/>
+            <w:tcMar>
+              <w:top w:w="100" w:type="dxa"/>
+              <w:left w:w="100" w:type="dxa"/>
+              <w:bottom w:w="100" w:type="dxa"/>
+              <w:right w:w="100" w:type="dxa"/>
+            </w:tcMar>
+            <w:hideMark/>
+          </w:tcPr>
+          <w:p>
+            <w:r>
+              <w:rPr>
+                <w:b/>
+                <w:bCs/>
+              </w:rPr>
+              <w:t>Partition</w:t>
+            </w:r>
+          </w:p>
+        </w:tc>
+        <w:tc>
+          <w:tcPr>
+            <w:tcW w:w="3000" w:type="auto"/>
+            <w:tcBorders>
+              <w:top w:val="single" w:sz="6" w:space="0" w:color="8A8A8A"/>
+              <w:left w:val="single" w:sz="6" w:space="0" w:color="8A8A8A"/>
+              <w:bottom w:val="single" w:sz="6" w:space="0" w:color="8A8A8A"/>
+              <w:right w:val="single" w:sz="6" w:space="0" w:color="8A8A8A"/>
+            </w:tcBorders>
+            <w:shd w:val="clear" w:color="auto" w:fill="D9EAF7"/>
+            <w:tcMar>
+              <w:top w:w="100" w:type="dxa"/>
+              <w:left w:w="100" w:type="dxa"/>
+              <w:bottom w:w="100" w:type="dxa"/>
+              <w:right w:w="100" w:type="dxa"/>
+            </w:tcMar>
+            <w:hideMark/>
+          </w:tcPr>
+          <w:p>
+            <w:r>
+              <w:rPr>
+                <w:b/>
+                <w:bCs/>
+              </w:rPr>
+              <w:t>Routing service state</w:t>
+            </w:r>
+          </w:p>
+        </w:tc>
+        <w:tc>
+          <w:tcPr>
+            <w:tcW w:w="3000" w:type="auto"/>
+            <w:tcBorders>
+              <w:top w:val="single" w:sz="6" w:space="0" w:color="8A8A8A"/>
+              <w:left w:val="single" w:sz="6" w:space="0" w:color="8A8A8A"/>
+              <w:bottom w:val="single" w:sz="6" w:space="0" w:color="8A8A8A"/>
+              <w:right w:val="single" w:sz="6" w:space="0" w:color="8A8A8A"/>
+            </w:tcBorders>
+            <w:shd w:val="clear" w:color="auto" w:fill="D9EAF7"/>
+            <w:tcMar>
+              <w:top w:w="100" w:type="dxa"/>
+              <w:left w:w="100" w:type="dxa"/>
+              <w:bottom w:w="100" w:type="dxa"/>
+              <w:right w:w="100" w:type="dxa"/>
+            </w:tcMar>
+            <w:hideMark/>
+          </w:tcPr>
+          <w:p>
+            <w:r>
+              <w:rPr>
+                <w:b/>
+                <w:bCs/>
+              </w:rPr>
+              <w:t>Expected lookup key</w:t>
+            </w:r>
+          </w:p>
+        </w:tc>
+      </w:tr>
+      <w:tr>
+        <w:tc>
+          <w:tcPr>
+            <w:tcW w:w="3000" w:type="auto"/>
+            <w:tcBorders>
+              <w:top w:val="single" w:sz="6" w:space="0" w:color="8A8A8A"/>
+              <w:left w:val="single" w:sz="6" w:space="0" w:color="8A8A8A"/>
+              <w:bottom w:val="single" w:sz="6" w:space="0" w:color="8A8A8A"/>
+              <w:right w:val="single" w:sz="6" w:space="0" w:color="8A8A8A"/>
+            </w:tcBorders>
+            <w:shd w:val="clear" w:color="auto" w:fill="D9EAF7"/>
+            <w:tcMar>
+              <w:top w:w="100" w:type="dxa"/>
+              <w:left w:w="100" w:type="dxa"/>
+              <w:bottom w:w="100" w:type="dxa"/>
+              <w:right w:w="100" w:type="dxa"/>
+            </w:tcMar>
+            <w:hideMark/>
+          </w:tcPr>
+          <w:p>
+            <w:r>
+              <w:t>Primary active</w:t>
+            </w:r>
+          </w:p>
+        </w:tc>
+        <w:tc>
+          <w:tcPr>
+            <w:tcW w:w="3000" w:type="auto"/>
+            <w:tcBorders>
+              <w:top w:val="single" w:sz="6" w:space="0" w:color="8A8A8A"/>
+              <w:left w:val="single" w:sz="6" w:space="0" w:color="8A8A8A"/>
+              <w:bottom w:val="single" w:sz="6" w:space="0" w:color="8A8A8A"/>
+              <w:right w:val="single" w:sz="6" w:space="0" w:color="8A8A8A"/>
+            </w:tcBorders>
+            <w:shd w:val="clear" w:color="auto" w:fill="D9EAF7"/>
+            <w:tcMar>
+              <w:top w:w="100" w:type="dxa"/>
+              <w:left w:w="100" w:type="dxa"/>
+              <w:bottom w:w="100" w:type="dxa"/>
+              <w:right w:w="100" w:type="dxa"/>
+            </w:tcMar>
+            <w:hideMark/>
+          </w:tcPr>
+          <w:p>
+            <w:r>
+              <w:t>PRIMARY_ACTIVE (default)</w:t>
+            </w:r>
+          </w:p>
+        </w:tc>
+        <w:tc>
+          <w:tcPr>
+            <w:tcW w:w="3000" w:type="auto"/>
+            <w:tcBorders>
+              <w:top w:val="single" w:sz="6" w:space="0" w:color="8A8A8A"/>
+              <w:left w:val="single" w:sz="6" w:space="0" w:color="8A8A8A"/>
+              <w:bottom w:val="single" w:sz="6" w:space="0" w:color="8A8A8A"/>
+              <w:right w:val="single" w:sz="6" w:space="0" w:color="8A8A8A"/>
+            </w:tcBorders>
+            <w:shd w:val="clear" w:color="auto" w:fill="D9EAF7"/>
+            <w:tcMar>
+              <w:top w:w="100" w:type="dxa"/>
+              <w:left w:w="100" w:type="dxa"/>
+              <w:bottom w:w="100" w:type="dxa"/>
+              <w:right w:w="100" w:type="dxa"/>
+            </w:tcMar>
+            <w:hideMark/>
+          </w:tcPr>
+          <w:p>
+            <w:r>
+              <w:t>DatabaseRole.PRIMARY</w:t>
+            </w:r>
+          </w:p>
+        </w:tc>
+      </w:tr>
+      <w:tr>
+        <w:tc>
+          <w:tcPr>
+            <w:tcW w:w="3000" w:type="auto"/>
+            <w:tcBorders>
+              <w:top w:val="single" w:sz="6" w:space="0" w:color="8A8A8A"/>
+              <w:left w:val="single" w:sz="6" w:space="0" w:color="8A8A8A"/>
+              <w:bottom w:val="single" w:sz="6" w:space="0" w:color="8A8A8A"/>
+              <w:right w:val="single" w:sz="6" w:space="0" w:color="8A8A8A"/>
+            </w:tcBorders>
+            <w:shd w:val="clear" w:color="auto" w:fill="D9EAF7"/>
+            <w:tcMar>
+              <w:top w:w="100" w:type="dxa"/>
+              <w:left w:w="100" w:type="dxa"/>
+              <w:bottom w:w="100" w:type="dxa"/>
+              <w:right w:w="100" w:type="dxa"/>
+            </w:tcMar>
+            <w:hideMark/>
+          </w:tcPr>
+          <w:p>
+            <w:r>
+              <w:t>Secondary active after failover</w:t>
+            </w:r>
+          </w:p>
+        </w:tc>
+        <w:tc>
+          <w:tcPr>
+            <w:tcW w:w="3000" w:type="auto"/>
+            <w:tcBorders>
+              <w:top w:val="single" w:sz="6" w:space="0" w:color="8A8A8A"/>
+              <w:left w:val="single" w:sz="6" w:space="0" w:color="8A8A8A"/>
+              <w:bottom w:val="single" w:sz="6" w:space="0" w:color="8A8A8A"/>
+              <w:right w:val="single" w:sz="6" w:space="0" w:color="8A8A8A"/>
+            </w:tcBorders>
+            <w:shd w:val="clear" w:color="auto" w:fill="D9EAF7"/>
+            <w:tcMar>
+              <w:top w:w="100" w:type="dxa"/>
+              <w:left w:w="100" w:type="dxa"/>
+              <w:bottom w:w="100" w:type="dxa"/>
+              <w:right w:w="100" w:type="dxa"/>
+            </w:tcMar>
+            <w:hideMark/>
+          </w:tcPr>
+          <w:p>
+            <w:r>
+              <w:t>SECONDARY_ACTIVE</w:t>
+            </w:r>
+          </w:p>
+        </w:tc>
+        <w:tc>
+          <w:tcPr>
+            <w:tcW w:w="3000" w:type="auto"/>
+            <w:tcBorders>
+              <w:top w:val="single" w:sz="6" w:space="0" w:color="8A8A8A"/>
+              <w:left w:val="single" w:sz="6" w:space="0" w:color="8A8A8A"/>
+              <w:bottom w:val="single" w:sz="6" w:space="0" w:color="8A8A8A"/>
+              <w:right w:val="single" w:sz="6" w:space="0" w:color="8A8A8A"/>
+            </w:tcBorders>
+            <w:shd w:val="clear" w:color="auto" w:fill="D9EAF7"/>
+            <w:tcMar>
+              <w:top w:w="100" w:type="dxa"/>
+              <w:left w:w="100" w:type="dxa"/>
+              <w:bottom w:w="100" w:type="dxa"/>
+              <w:right w:w="100" w:type="dxa"/>
+            </w:tcMar>
+            <w:hideMark/>
+          </w:tcPr>
+          <w:p>
+            <w:r>
+              <w:t>DatabaseRole.SECONDARY</w:t>
+            </w:r>
+          </w:p>
+        </w:tc>
+      </w:tr>
+      <w:tr>
+        <w:tc>
+          <w:tcPr>
+            <w:tcW w:w="3000" w:type="auto"/>
+            <w:tcBorders>
+              <w:top w:val="single" w:sz="6" w:space="0" w:color="8A8A8A"/>
+              <w:left w:val="single" w:sz="6" w:space="0" w:color="8A8A8A"/>
+              <w:bottom w:val="single" w:sz="6" w:space="0" w:color="8A8A8A"/>
+              <w:right w:val="single" w:sz="6" w:space="0" w:color="8A8A8A"/>
+            </w:tcBorders>
+            <w:shd w:val="clear" w:color="auto" w:fill="D9EAF7"/>
+            <w:tcMar>
+              <w:top w:w="100" w:type="dxa"/>
+              <w:left w:w="100" w:type="dxa"/>
+              <w:bottom w:w="100" w:type="dxa"/>
+              <w:right w:w="100" w:type="dxa"/>
+            </w:tcMar>
+            <w:hideMark/>
+          </w:tcPr>
+          <w:p>
+            <w:r>
+              <w:t>Primary active after failback</w:t>
+            </w:r>
+          </w:p>
+        </w:tc>
+        <w:tc>
+          <w:tcPr>
+            <w:tcW w:w="3000" w:type="auto"/>
+            <w:tcBorders>
+              <w:top w:val="single" w:sz="6" w:space="0" w:color="8A8A8A"/>
+              <w:left w:val="single" w:sz="6" w:space="0" w:color="8A8A8A"/>
+              <w:bottom w:val="single" w:sz="6" w:space="0" w:color="8A8A8A"/>
+              <w:right w:val="single" w:sz="6" w:space="0" w:color="8A8A8A"/>
+            </w:tcBorders>
+            <w:shd w:val="clear" w:color="auto" w:fill="D9EAF7"/>
+            <w:tcMar>
+              <w:top w:w="100" w:type="dxa"/>
+              <w:left w:w="100" w:type="dxa"/>
+              <w:bottom w:w="100" w:type="dxa"/>
+              <w:right w:w="100" w:type="dxa"/>
+            </w:tcMar>
+            <w:hideMark/>
+          </w:tcPr>
+          <w:p>
+            <w:r>
+              <w:t>PRIMARY_ACTIVE (after full failback cycle)</w:t>
+            </w:r>
+          </w:p>
+        </w:tc>
+        <w:tc>
+          <w:tcPr>
+            <w:tcW w:w="3000" w:type="auto"/>
+            <w:tcBorders>
+              <w:top w:val="single" w:sz="6" w:space="0" w:color="8A8A8A"/>
+              <w:left w:val="single" w:sz="6" w:space="0" w:color="8A8A8A"/>
+              <w:bottom w:val="single" w:sz="6" w:space="0" w:color="8A8A8A"/>
+              <w:right w:val="single" w:sz="6" w:space="0" w:color="8A8A8A"/>
+            </w:tcBorders>
+            <w:shd w:val="clear" w:color="auto" w:fill="D9EAF7"/>
+            <w:tcMar>
+              <w:top w:w="100" w:type="dxa"/>
+              <w:left w:w="100" w:type="dxa"/>
+              <w:bottom w:w="100" w:type="dxa"/>
+              <w:right w:w="100" w:type="dxa"/>
+            </w:tcMar>
+            <w:hideMark/>
+          </w:tcPr>
+          <w:p>
+            <w:r>
+              <w:t>DatabaseRole.PRIMARY</w:t>
+            </w:r>
+          </w:p>
+        </w:tc>
+      </w:tr>
+    </w:tbl>
+    <w:p>
+      <w:r>
+        <w:t xml:space="preserve"> </w:t>
+      </w:r>
+    </w:p>
+    <w:p>
+      <w:r>
+        <w:t>Unit Tests</w:t>
+      </w:r>
+    </w:p>
+    <w:tbl>
+      <w:tblPr>
+        <w:tblW w:w="0" w:type="auto"/>
+        <w:tblCellMar>
+          <w:top w:w="15" w:type="dxa"/>
+          <w:left w:w="15" w:type="dxa"/>
+          <w:bottom w:w="15" w:type="dxa"/>
+          <w:right w:w="15" w:type="dxa"/>
+        </w:tblCellMar>
+        <w:tblLook w:val="04A0" w:firstRow="1" w:lastRow="0" w:firstColumn="1" w:lastColumn="0" w:noHBand="0" w:noVBand="1"/>
+      </w:tblPr>
+      <w:tblGrid>
+        <w:gridCol w:w="1800"/>
+        <w:gridCol w:w="1800"/>
+        <w:gridCol w:w="1800"/>
+        <w:gridCol w:w="1800"/>
+        <w:gridCol w:w="1800"/>
+      </w:tblGrid>
+      <w:tr>
+        <w:tc>
+          <w:tcPr>
+            <w:tcW w:w="1800" w:type="auto"/>
+            <w:tcBorders>
+              <w:top w:val="single" w:sz="6" w:space="0" w:color="8A8A8A"/>
+              <w:left w:val="single" w:sz="6" w:space="0" w:color="8A8A8A"/>
+              <w:bottom w:val="single" w:sz="6" w:space="0" w:color="8A8A8A"/>
+              <w:right w:val="single" w:sz="6" w:space="0" w:color="8A8A8A"/>
+            </w:tcBorders>
+            <w:shd w:val="clear" w:color="auto" w:fill="D9EAF7"/>
+            <w:tcMar>
+              <w:top w:w="100" w:type="dxa"/>
+              <w:left w:w="100" w:type="dxa"/>
+              <w:bottom w:w="100" w:type="dxa"/>
+              <w:right w:w="100" w:type="dxa"/>
+            </w:tcMar>
+            <w:hideMark/>
+          </w:tcPr>
+          <w:p>
+            <w:r>
+              <w:rPr>
+                <w:b/>
+                <w:bCs/>
+              </w:rPr>
+              <w:t>Test case</w:t>
+            </w:r>
+          </w:p>
+        </w:tc>
+        <w:tc>
+          <w:tcPr>
+            <w:tcW w:w="1800" w:type="auto"/>
+            <w:tcBorders>
+              <w:top w:val="single" w:sz="6" w:space="0" w:color="8A8A8A"/>
+              <w:left w:val="single" w:sz="6" w:space="0" w:color="8A8A8A"/>
+              <w:bottom w:val="single" w:sz="6" w:space="0" w:color="8A8A8A"/>
+              <w:right w:val="single" w:sz="6" w:space="0" w:color="8A8A8A"/>
+            </w:tcBorders>
+            <w:shd w:val="clear" w:color="auto" w:fill="D9EAF7"/>
+            <w:tcMar>
+              <w:top w:w="100" w:type="dxa"/>
+              <w:left w:w="100" w:type="dxa"/>
+              <w:bottom w:w="100" w:type="dxa"/>
+              <w:right w:w="100" w:type="dxa"/>
+            </w:tcMar>
+            <w:hideMark/>
+          </w:tcPr>
+          <w:p>
+            <w:r>
+              <w:rPr>
+                <w:b/>
+                <w:bCs/>
+              </w:rPr>
+              <w:t>Expected result</w:t>
+            </w:r>
+          </w:p>
+        </w:tc>
+        <w:tc>
+          <w:tcPr>
+            <w:tcW w:w="1800" w:type="auto"/>
+            <w:tcBorders>
+              <w:top w:val="single" w:sz="6" w:space="0" w:color="8A8A8A"/>
+              <w:left w:val="single" w:sz="6" w:space="0" w:color="8A8A8A"/>
+              <w:bottom w:val="single" w:sz="6" w:space="0" w:color="8A8A8A"/>
+              <w:right w:val="single" w:sz="6" w:space="0" w:color="8A8A8A"/>
+            </w:tcBorders>
+            <w:shd w:val="clear" w:color="auto" w:fill="D9EAF7"/>
+            <w:tcMar>
+              <w:top w:w="100" w:type="dxa"/>
+              <w:left w:w="100" w:type="dxa"/>
+              <w:bottom w:w="100" w:type="dxa"/>
+              <w:right w:w="100" w:type="dxa"/>
+            </w:tcMar>
+            <w:hideMark/>
+          </w:tcPr>
+          <w:p>
+            <w:r>
+              <w:rPr>
+                <w:b/>
+                <w:bCs/>
+              </w:rPr>
+              <w:t>Reason</w:t>
+            </w:r>
+          </w:p>
+        </w:tc>
+        <w:tc>
+          <w:tcPr>
+            <w:tcW w:w="1800" w:type="auto"/>
+            <w:tcBorders>
+              <w:top w:val="single" w:sz="6" w:space="0" w:color="8A8A8A"/>
+              <w:left w:val="single" w:sz="6" w:space="0" w:color="8A8A8A"/>
+              <w:bottom w:val="single" w:sz="6" w:space="0" w:color="8A8A8A"/>
+              <w:right w:val="single" w:sz="6" w:space="0" w:color="8A8A8A"/>
+            </w:tcBorders>
+            <w:shd w:val="clear" w:color="auto" w:fill="D9EAF7"/>
+            <w:tcMar>
+              <w:top w:w="100" w:type="dxa"/>
+              <w:left w:w="100" w:type="dxa"/>
+              <w:bottom w:w="100" w:type="dxa"/>
+              <w:right w:w="100" w:type="dxa"/>
+            </w:tcMar>
+            <w:hideMark/>
+          </w:tcPr>
+          <w:p>
+            <w:r>
+              <w:rPr>
+                <w:b/>
+                <w:bCs/>
+              </w:rPr>
+              <w:t>Test class</w:t>
+            </w:r>
+          </w:p>
+        </w:tc>
+        <w:tc>
+          <w:tcPr>
+            <w:tcW w:w="1800" w:type="auto"/>
+            <w:tcBorders>
+              <w:top w:val="single" w:sz="6" w:space="0" w:color="8A8A8A"/>
+              <w:left w:val="single" w:sz="6" w:space="0" w:color="8A8A8A"/>
+              <w:bottom w:val="single" w:sz="6" w:space="0" w:color="8A8A8A"/>
+              <w:right w:val="single" w:sz="6" w:space="0" w:color="8A8A8A"/>
+            </w:tcBorders>
+            <w:shd w:val="clear" w:color="auto" w:fill="D9EAF7"/>
+            <w:tcMar>
+              <w:top w:w="100" w:type="dxa"/>
+              <w:left w:w="100" w:type="dxa"/>
+              <w:bottom w:w="100" w:type="dxa"/>
+              <w:right w:w="100" w:type="dxa"/>
+            </w:tcMar>
+            <w:hideMark/>
+          </w:tcPr>
+          <w:p>
+            <w:r>
+              <w:rPr>
+                <w:b/>
+                <w:bCs/>
+              </w:rPr>
+              <w:t>Implemented unit test</w:t>
+            </w:r>
+          </w:p>
+        </w:tc>
+      </w:tr>
+      <w:tr>
+        <w:tc>
+          <w:tcPr>
+            <w:tcW w:w="1800" w:type="auto"/>
+            <w:tcBorders>
+              <w:top w:val="single" w:sz="6" w:space="0" w:color="8A8A8A"/>
+              <w:left w:val="single" w:sz="6" w:space="0" w:color="8A8A8A"/>
+              <w:bottom w:val="single" w:sz="6" w:space="0" w:color="8A8A8A"/>
+              <w:right w:val="single" w:sz="6" w:space="0" w:color="8A8A8A"/>
+            </w:tcBorders>
+            <w:shd w:val="clear" w:color="auto" w:fill="D9EAF7"/>
+            <w:tcMar>
+              <w:top w:w="100" w:type="dxa"/>
+              <w:left w:w="100" w:type="dxa"/>
+              <w:bottom w:w="100" w:type="dxa"/>
+              <w:right w:w="100" w:type="dxa"/>
+            </w:tcMar>
+            <w:hideMark/>
+          </w:tcPr>
+          <w:p>
+            <w:r>
+              <w:t>Lookup key when routing reports PRIMARY</w:t>
+            </w:r>
+          </w:p>
+        </w:tc>
+        <w:tc>
+          <w:tcPr>
+            <w:tcW w:w="1800" w:type="auto"/>
+            <w:tcBorders>
+              <w:top w:val="single" w:sz="6" w:space="0" w:color="8A8A8A"/>
+              <w:left w:val="single" w:sz="6" w:space="0" w:color="8A8A8A"/>
+              <w:bottom w:val="single" w:sz="6" w:space="0" w:color="8A8A8A"/>
+              <w:right w:val="single" w:sz="6" w:space="0" w:color="8A8A8A"/>
+            </w:tcBorders>
+            <w:shd w:val="clear" w:color="auto" w:fill="D9EAF7"/>
+            <w:tcMar>
+              <w:top w:w="100" w:type="dxa"/>
+              <w:left w:w="100" w:type="dxa"/>
+              <w:bottom w:w="100" w:type="dxa"/>
+              <w:right w:w="100" w:type="dxa"/>
+            </w:tcMar>
+            <w:hideMark/>
+          </w:tcPr>
+          <w:p>
+            <w:r>
+              <w:t>Returns PRIMARY</w:t>
+            </w:r>
+          </w:p>
+        </w:tc>
+        <w:tc>
+          <w:tcPr>
+            <w:tcW w:w="1800" w:type="auto"/>
+            <w:tcBorders>
+              <w:top w:val="single" w:sz="6" w:space="0" w:color="8A8A8A"/>
+              <w:left w:val="single" w:sz="6" w:space="0" w:color="8A8A8A"/>
+              <w:bottom w:val="single" w:sz="6" w:space="0" w:color="8A8A8A"/>
+              <w:right w:val="single" w:sz="6" w:space="0" w:color="8A8A8A"/>
+            </w:tcBorders>
+            <w:shd w:val="clear" w:color="auto" w:fill="D9EAF7"/>
+            <w:tcMar>
+              <w:top w:w="100" w:type="dxa"/>
+              <w:left w:w="100" w:type="dxa"/>
+              <w:bottom w:w="100" w:type="dxa"/>
+              <w:right w:w="100" w:type="dxa"/>
+            </w:tcMar>
+            <w:hideMark/>
+          </w:tcPr>
+          <w:p>
+            <w:r>
+              <w:t>Verifies default partition</w:t>
+            </w:r>
+          </w:p>
+        </w:tc>
+        <w:tc>
+          <w:tcPr>
+            <w:tcW w:w="1800" w:type="auto"/>
+            <w:tcBorders>
+              <w:top w:val="single" w:sz="6" w:space="0" w:color="8A8A8A"/>
+              <w:left w:val="single" w:sz="6" w:space="0" w:color="8A8A8A"/>
+              <w:bottom w:val="single" w:sz="6" w:space="0" w:color="8A8A8A"/>
+              <w:right w:val="single" w:sz="6" w:space="0" w:color="8A8A8A"/>
+            </w:tcBorders>
+            <w:shd w:val="clear" w:color="auto" w:fill="D9EAF7"/>
+            <w:tcMar>
+              <w:top w:w="100" w:type="dxa"/>
+              <w:left w:w="100" w:type="dxa"/>
+              <w:bottom w:w="100" w:type="dxa"/>
+              <w:right w:w="100" w:type="dxa"/>
+            </w:tcMar>
+            <w:hideMark/>
+          </w:tcPr>
+          <w:p>
+            <w:r>
+              <w:t>RoutingDataSourceTest</w:t>
+            </w:r>
+          </w:p>
+        </w:tc>
+        <w:tc>
+          <w:tcPr>
+            <w:tcW w:w="1800" w:type="auto"/>
+            <w:tcBorders>
+              <w:top w:val="single" w:sz="6" w:space="0" w:color="8A8A8A"/>
+              <w:left w:val="single" w:sz="6" w:space="0" w:color="8A8A8A"/>
+              <w:bottom w:val="single" w:sz="6" w:space="0" w:color="8A8A8A"/>
+              <w:right w:val="single" w:sz="6" w:space="0" w:color="8A8A8A"/>
+            </w:tcBorders>
+            <w:shd w:val="clear" w:color="auto" w:fill="D9EAF7"/>
+            <w:tcMar>
+              <w:top w:w="100" w:type="dxa"/>
+              <w:left w:w="100" w:type="dxa"/>
+              <w:bottom w:w="100" w:type="dxa"/>
+              <w:right w:w="100" w:type="dxa"/>
+            </w:tcMar>
+            <w:hideMark/>
+          </w:tcPr>
+          <w:p>
+            <w:r>
+              <w:t>lookupKeyIsPrimaryWhenRoutingServiceReportsPrimary</w:t>
+            </w:r>
+          </w:p>
+        </w:tc>
+      </w:tr>
+      <w:tr>
+        <w:tc>
+          <w:tcPr>
+            <w:tcW w:w="1800" w:type="auto"/>
+            <w:tcBorders>
+              <w:top w:val="single" w:sz="6" w:space="0" w:color="8A8A8A"/>
+              <w:left w:val="single" w:sz="6" w:space="0" w:color="8A8A8A"/>
+              <w:bottom w:val="single" w:sz="6" w:space="0" w:color="8A8A8A"/>
+              <w:right w:val="single" w:sz="6" w:space="0" w:color="8A8A8A"/>
+            </w:tcBorders>
+            <w:shd w:val="clear" w:color="auto" w:fill="D9EAF7"/>
+            <w:tcMar>
+              <w:top w:w="100" w:type="dxa"/>
+              <w:left w:w="100" w:type="dxa"/>
+              <w:bottom w:w="100" w:type="dxa"/>
+              <w:right w:w="100" w:type="dxa"/>
+            </w:tcMar>
+            <w:hideMark/>
+          </w:tcPr>
+          <w:p>
+            <w:r>
+              <w:t>Lookup key follows role after failover</w:t>
+            </w:r>
+          </w:p>
+        </w:tc>
+        <w:tc>
+          <w:tcPr>
+            <w:tcW w:w="1800" w:type="auto"/>
+            <w:tcBorders>
+              <w:top w:val="single" w:sz="6" w:space="0" w:color="8A8A8A"/>
+              <w:left w:val="single" w:sz="6" w:space="0" w:color="8A8A8A"/>
+              <w:bottom w:val="single" w:sz="6" w:space="0" w:color="8A8A8A"/>
+              <w:right w:val="single" w:sz="6" w:space="0" w:color="8A8A8A"/>
+            </w:tcBorders>
+            <w:shd w:val="clear" w:color="auto" w:fill="D9EAF7"/>
+            <w:tcMar>
+              <w:top w:w="100" w:type="dxa"/>
+              <w:left w:w="100" w:type="dxa"/>
+              <w:bottom w:w="100" w:type="dxa"/>
+              <w:right w:w="100" w:type="dxa"/>
+            </w:tcMar>
+            <w:hideMark/>
+          </w:tcPr>
+          <w:p>
+            <w:r>
+              <w:t>Returns SECONDARY</w:t>
+            </w:r>
+          </w:p>
+        </w:tc>
+        <w:tc>
+          <w:tcPr>
+            <w:tcW w:w="1800" w:type="auto"/>
+            <w:tcBorders>
+              <w:top w:val="single" w:sz="6" w:space="0" w:color="8A8A8A"/>
+              <w:left w:val="single" w:sz="6" w:space="0" w:color="8A8A8A"/>
+              <w:bottom w:val="single" w:sz="6" w:space="0" w:color="8A8A8A"/>
+              <w:right w:val="single" w:sz="6" w:space="0" w:color="8A8A8A"/>
+            </w:tcBorders>
+            <w:shd w:val="clear" w:color="auto" w:fill="D9EAF7"/>
+            <w:tcMar>
+              <w:top w:w="100" w:type="dxa"/>
+              <w:left w:w="100" w:type="dxa"/>
+              <w:bottom w:w="100" w:type="dxa"/>
+              <w:right w:w="100" w:type="dxa"/>
+            </w:tcMar>
+            <w:hideMark/>
+          </w:tcPr>
+          <w:p>
+            <w:r>
+              <w:t>Verifies post-failover partition</w:t>
+            </w:r>
+          </w:p>
+        </w:tc>
+        <w:tc>
+          <w:tcPr>
+            <w:tcW w:w="1800" w:type="auto"/>
+            <w:tcBorders>
+              <w:top w:val="single" w:sz="6" w:space="0" w:color="8A8A8A"/>
+              <w:left w:val="single" w:sz="6" w:space="0" w:color="8A8A8A"/>
+              <w:bottom w:val="single" w:sz="6" w:space="0" w:color="8A8A8A"/>
+              <w:right w:val="single" w:sz="6" w:space="0" w:color="8A8A8A"/>
+            </w:tcBorders>
+            <w:shd w:val="clear" w:color="auto" w:fill="D9EAF7"/>
+            <w:tcMar>
+              <w:top w:w="100" w:type="dxa"/>
+              <w:left w:w="100" w:type="dxa"/>
+              <w:bottom w:w="100" w:type="dxa"/>
+              <w:right w:w="100" w:type="dxa"/>
+            </w:tcMar>
+            <w:hideMark/>
+          </w:tcPr>
+          <w:p>
+            <w:r>
+              <w:t>RoutingDataSourceTest</w:t>
+            </w:r>
+          </w:p>
+        </w:tc>
+        <w:tc>
+          <w:tcPr>
+            <w:tcW w:w="1800" w:type="auto"/>
+            <w:tcBorders>
+              <w:top w:val="single" w:sz="6" w:space="0" w:color="8A8A8A"/>
+              <w:left w:val="single" w:sz="6" w:space="0" w:color="8A8A8A"/>
+              <w:bottom w:val="single" w:sz="6" w:space="0" w:color="8A8A8A"/>
+              <w:right w:val="single" w:sz="6" w:space="0" w:color="8A8A8A"/>
+            </w:tcBorders>
+            <w:shd w:val="clear" w:color="auto" w:fill="D9EAF7"/>
+            <w:tcMar>
+              <w:top w:w="100" w:type="dxa"/>
+              <w:left w:w="100" w:type="dxa"/>
+              <w:bottom w:w="100" w:type="dxa"/>
+              <w:right w:w="100" w:type="dxa"/>
+            </w:tcMar>
+            <w:hideMark/>
+          </w:tcPr>
+          <w:p>
+            <w:r>
+              <w:t>lookupKeyFollowsRoleAfterFailover</w:t>
+            </w:r>
+          </w:p>
+        </w:tc>
+      </w:tr>
+      <w:tr>
+        <w:tc>
+          <w:tcPr>
+            <w:tcW w:w="1800" w:type="auto"/>
+            <w:tcBorders>
+              <w:top w:val="single" w:sz="6" w:space="0" w:color="8A8A8A"/>
+              <w:left w:val="single" w:sz="6" w:space="0" w:color="8A8A8A"/>
+              <w:bottom w:val="single" w:sz="6" w:space="0" w:color="8A8A8A"/>
+              <w:right w:val="single" w:sz="6" w:space="0" w:color="8A8A8A"/>
+            </w:tcBorders>
+            <w:shd w:val="clear" w:color="auto" w:fill="D9EAF7"/>
+            <w:tcMar>
+              <w:top w:w="100" w:type="dxa"/>
+              <w:left w:w="100" w:type="dxa"/>
+              <w:bottom w:w="100" w:type="dxa"/>
+              <w:right w:w="100" w:type="dxa"/>
+            </w:tcMar>
+            <w:hideMark/>
+          </w:tcPr>
+          <w:p>
+            <w:r>
+              <w:t>Lookup key returns to primary after failback</w:t>
+            </w:r>
+          </w:p>
+        </w:tc>
+        <w:tc>
+          <w:tcPr>
+            <w:tcW w:w="1800" w:type="auto"/>
+            <w:tcBorders>
+              <w:top w:val="single" w:sz="6" w:space="0" w:color="8A8A8A"/>
+              <w:left w:val="single" w:sz="6" w:space="0" w:color="8A8A8A"/>
+              <w:bottom w:val="single" w:sz="6" w:space="0" w:color="8A8A8A"/>
+              <w:right w:val="single" w:sz="6" w:space="0" w:color="8A8A8A"/>
+            </w:tcBorders>
+            <w:shd w:val="clear" w:color="auto" w:fill="D9EAF7"/>
+            <w:tcMar>
+              <w:top w:w="100" w:type="dxa"/>
+              <w:left w:w="100" w:type="dxa"/>
+              <w:bottom w:w="100" w:type="dxa"/>
+              <w:right w:w="100" w:type="dxa"/>
+            </w:tcMar>
+            <w:hideMark/>
+          </w:tcPr>
+          <w:p>
+            <w:r>
+              <w:t>Returns PRIMARY</w:t>
+            </w:r>
+          </w:p>
+        </w:tc>
+        <w:tc>
+          <w:tcPr>
+            <w:tcW w:w="1800" w:type="auto"/>
+            <w:tcBorders>
+              <w:top w:val="single" w:sz="6" w:space="0" w:color="8A8A8A"/>
+              <w:left w:val="single" w:sz="6" w:space="0" w:color="8A8A8A"/>
+              <w:bottom w:val="single" w:sz="6" w:space="0" w:color="8A8A8A"/>
+              <w:right w:val="single" w:sz="6" w:space="0" w:color="8A8A8A"/>
+            </w:tcBorders>
+            <w:shd w:val="clear" w:color="auto" w:fill="D9EAF7"/>
+            <w:tcMar>
+              <w:top w:w="100" w:type="dxa"/>
+              <w:left w:w="100" w:type="dxa"/>
+              <w:bottom w:w="100" w:type="dxa"/>
+              <w:right w:w="100" w:type="dxa"/>
+            </w:tcMar>
+            <w:hideMark/>
+          </w:tcPr>
+          <w:p>
+            <w:r>
+              <w:t>Verifies post-failback partition</w:t>
+            </w:r>
+          </w:p>
+        </w:tc>
+        <w:tc>
+          <w:tcPr>
+            <w:tcW w:w="1800" w:type="auto"/>
+            <w:tcBorders>
+              <w:top w:val="single" w:sz="6" w:space="0" w:color="8A8A8A"/>
+              <w:left w:val="single" w:sz="6" w:space="0" w:color="8A8A8A"/>
+              <w:bottom w:val="single" w:sz="6" w:space="0" w:color="8A8A8A"/>
+              <w:right w:val="single" w:sz="6" w:space="0" w:color="8A8A8A"/>
+            </w:tcBorders>
+            <w:shd w:val="clear" w:color="auto" w:fill="D9EAF7"/>
+            <w:tcMar>
+              <w:top w:w="100" w:type="dxa"/>
+              <w:left w:w="100" w:type="dxa"/>
+              <w:bottom w:w="100" w:type="dxa"/>
+              <w:right w:w="100" w:type="dxa"/>
+            </w:tcMar>
+            <w:hideMark/>
+          </w:tcPr>
+          <w:p>
+            <w:r>
+              <w:t>RoutingDataSourceTest</w:t>
+            </w:r>
+          </w:p>
+        </w:tc>
+        <w:tc>
+          <w:tcPr>
+            <w:tcW w:w="1800" w:type="auto"/>
+            <w:tcBorders>
+              <w:top w:val="single" w:sz="6" w:space="0" w:color="8A8A8A"/>
+              <w:left w:val="single" w:sz="6" w:space="0" w:color="8A8A8A"/>
+              <w:bottom w:val="single" w:sz="6" w:space="0" w:color="8A8A8A"/>
+              <w:right w:val="single" w:sz="6" w:space="0" w:color="8A8A8A"/>
+            </w:tcBorders>
+            <w:shd w:val="clear" w:color="auto" w:fill="D9EAF7"/>
+            <w:tcMar>
+              <w:top w:w="100" w:type="dxa"/>
+              <w:left w:w="100" w:type="dxa"/>
+              <w:bottom w:w="100" w:type="dxa"/>
+              <w:right w:w="100" w:type="dxa"/>
+            </w:tcMar>
+            <w:hideMark/>
+          </w:tcPr>
+          <w:p>
+            <w:r>
+              <w:t>lookupKeyReturnsToPrimaryAfterFailback</w:t>
+            </w:r>
+          </w:p>
+        </w:tc>
+      </w:tr>
+    </w:tbl>
+    <w:p>
+      <w:r>
+        <w:t xml:space="preserve"> </w:t>
       </w:r>
     </w:p>
     <w:sectPr>

</xml_diff>